<commit_message>
have to install with automation using Nix and Devbox
</commit_message>
<xml_diff>
--- a/docs (kubernetes)/youtube_devops_directive.docx
+++ b/docs (kubernetes)/youtube_devops_directive.docx
@@ -131,7 +131,7 @@
       </w:pPr>
       <w:r>
         <w:rPr>
-          <w:rFonts w:ascii="SimSun" w:hAnsi="SimSun" w:eastAsia="SimSun" w:cs="SimSun"/>
+          <w:rFonts w:hint="default" w:ascii="Bodoni MT" w:hAnsi="Bodoni MT" w:eastAsia="SimSun" w:cs="Bodoni MT"/>
           <w:sz w:val="24"/>
           <w:szCs w:val="24"/>
         </w:rPr>
@@ -1163,7 +1163,7 @@
       </w:pPr>
       <w:r>
         <w:rPr>
-          <w:rFonts w:ascii="SimSun" w:hAnsi="SimSun" w:eastAsia="SimSun" w:cs="SimSun"/>
+          <w:rFonts w:hint="default" w:ascii="Bodoni MT" w:hAnsi="Bodoni MT" w:eastAsia="SimSun" w:cs="Bodoni MT"/>
           <w:sz w:val="24"/>
           <w:szCs w:val="24"/>
         </w:rPr>
@@ -1342,6 +1342,7 @@
         <w:keepLines w:val="0"/>
         <w:widowControl/>
         <w:numPr>
+          <w:ilvl w:val="0"/>
           <w:numId w:val="0"/>
         </w:numPr>
         <w:suppressLineNumbers w:val="0"/>
@@ -1499,6 +1500,7 @@
         <w:keepLines w:val="0"/>
         <w:widowControl/>
         <w:numPr>
+          <w:ilvl w:val="0"/>
           <w:numId w:val="0"/>
         </w:numPr>
         <w:suppressLineNumbers w:val="0"/>
@@ -1607,6 +1609,7 @@
         <w:keepLines w:val="0"/>
         <w:widowControl/>
         <w:numPr>
+          <w:ilvl w:val="0"/>
           <w:numId w:val="0"/>
         </w:numPr>
         <w:suppressLineNumbers w:val="0"/>
@@ -1797,6 +1800,7 @@
         <w:keepLines w:val="0"/>
         <w:widowControl/>
         <w:numPr>
+          <w:ilvl w:val="0"/>
           <w:numId w:val="0"/>
         </w:numPr>
         <w:suppressLineNumbers w:val="0"/>
@@ -2177,6 +2181,7 @@
         <w:keepLines w:val="0"/>
         <w:widowControl/>
         <w:numPr>
+          <w:ilvl w:val="0"/>
           <w:numId w:val="0"/>
         </w:numPr>
         <w:suppressLineNumbers w:val="0"/>
@@ -2457,6 +2462,7 @@
         <w:keepLines w:val="0"/>
         <w:widowControl/>
         <w:numPr>
+          <w:ilvl w:val="0"/>
           <w:numId w:val="0"/>
         </w:numPr>
         <w:suppressLineNumbers w:val="0"/>
@@ -2625,6 +2631,7 @@
         <w:keepLines w:val="0"/>
         <w:widowControl/>
         <w:numPr>
+          <w:ilvl w:val="0"/>
           <w:numId w:val="0"/>
         </w:numPr>
         <w:suppressLineNumbers w:val="0"/>
@@ -3926,6 +3933,7 @@
         <w:keepLines w:val="0"/>
         <w:widowControl/>
         <w:numPr>
+          <w:ilvl w:val="0"/>
           <w:numId w:val="0"/>
         </w:numPr>
         <w:suppressLineNumbers w:val="0"/>
@@ -4151,7 +4159,32 @@
           <w:szCs w:val="22"/>
           <w:lang w:val="en-IN"/>
         </w:rPr>
-        <w:t>Lets say you install all inside one VM.</w:t>
+        <w:t xml:space="preserve">Lets say you install </w:t>
+      </w:r>
+      <w:r>
+        <w:rPr>
+          <w:rFonts w:hint="default" w:ascii="Bodoni MT" w:hAnsi="Bodoni MT" w:eastAsia="等线" w:cs="Bodoni MT"/>
+          <w:color w:val="FFFFFF" w:themeColor="background1"/>
+          <w:sz w:val="22"/>
+          <w:szCs w:val="22"/>
+          <w:highlight w:val="darkMagenta"/>
+          <w:lang w:val="en-IN"/>
+          <w14:textFill>
+            <w14:solidFill>
+              <w14:schemeClr w14:val="bg1"/>
+            </w14:solidFill>
+          </w14:textFill>
+        </w:rPr>
+        <w:t>all inside one VM</w:t>
+      </w:r>
+      <w:r>
+        <w:rPr>
+          <w:rFonts w:hint="default" w:ascii="Bodoni MT" w:hAnsi="Bodoni MT" w:eastAsia="等线" w:cs="Bodoni MT"/>
+          <w:sz w:val="22"/>
+          <w:szCs w:val="22"/>
+          <w:lang w:val="en-IN"/>
+        </w:rPr>
+        <w:t>.</w:t>
       </w:r>
     </w:p>
     <w:p>
@@ -4481,6 +4514,16 @@
           <w:lang w:val="en-IN"/>
         </w:rPr>
         <w:tab/>
+      </w:r>
+      <w:r>
+        <w:rPr>
+          <w:rFonts w:hint="default" w:ascii="Bodoni MT" w:hAnsi="Bodoni MT" w:eastAsia="等线" w:cs="Bodoni MT"/>
+          <w:b w:val="0"/>
+          <w:bCs w:val="0"/>
+          <w:sz w:val="22"/>
+          <w:szCs w:val="22"/>
+          <w:lang w:val="en-IN"/>
+        </w:rPr>
         <w:t xml:space="preserve">As we have only node inside which all processes are running, so </w:t>
       </w:r>
       <w:r>
@@ -4526,6 +4569,16 @@
           <w:lang w:val="en-IN"/>
         </w:rPr>
         <w:tab/>
+      </w:r>
+      <w:r>
+        <w:rPr>
+          <w:rFonts w:hint="default" w:ascii="Bodoni MT" w:hAnsi="Bodoni MT" w:eastAsia="等线" w:cs="Bodoni MT"/>
+          <w:b w:val="0"/>
+          <w:bCs w:val="0"/>
+          <w:sz w:val="22"/>
+          <w:szCs w:val="22"/>
+          <w:lang w:val="en-IN"/>
+        </w:rPr>
         <w:t>So, all the pods will be running inside the same VM.</w:t>
       </w:r>
     </w:p>
@@ -4968,6 +5021,14 @@
           <w:lang w:val="en-IN"/>
         </w:rPr>
         <w:tab/>
+      </w:r>
+      <w:r>
+        <w:rPr>
+          <w:rFonts w:hint="default" w:ascii="Bodoni MT" w:hAnsi="Bodoni MT" w:eastAsia="等线" w:cs="Bodoni MT"/>
+          <w:sz w:val="22"/>
+          <w:szCs w:val="22"/>
+          <w:lang w:val="en-IN"/>
+        </w:rPr>
         <w:t>It only knows about the nodes. Because the nodes are VMs of the same Cloud Provider only. It can forward the request to those.</w:t>
       </w:r>
     </w:p>
@@ -5071,6 +5132,16 @@
           <w:lang w:val="en-IN"/>
         </w:rPr>
         <w:tab/>
+      </w:r>
+      <w:r>
+        <w:rPr>
+          <w:rFonts w:hint="default" w:ascii="Bodoni MT" w:hAnsi="Bodoni MT" w:eastAsia="等线" w:cs="Bodoni MT"/>
+          <w:b w:val="0"/>
+          <w:bCs w:val="0"/>
+          <w:sz w:val="22"/>
+          <w:szCs w:val="22"/>
+          <w:lang w:val="en-IN"/>
+        </w:rPr>
         <w:t xml:space="preserve">Means, there can be multiple pods running inside the same Node, here </w:t>
       </w:r>
       <w:r>
@@ -5419,6 +5490,7 @@
         <w:keepLines w:val="0"/>
         <w:widowControl/>
         <w:numPr>
+          <w:ilvl w:val="0"/>
           <w:numId w:val="0"/>
         </w:numPr>
         <w:suppressLineNumbers w:val="0"/>
@@ -5718,6 +5790,9 @@
         </w:rPr>
       </w:pPr>
       <w:r>
+        <w:rPr>
+          <w:rFonts w:hint="default" w:ascii="Bodoni MT" w:hAnsi="Bodoni MT" w:cs="Bodoni MT"/>
+        </w:rPr>
         <w:drawing>
           <wp:inline distT="0" distB="0" distL="114300" distR="114300">
             <wp:extent cx="4312920" cy="1626235"/>
@@ -7654,6 +7729,9 @@
         <w:br w:type="textWrapping"/>
       </w:r>
       <w:r>
+        <w:rPr>
+          <w:rFonts w:hint="default" w:ascii="Bodoni MT" w:hAnsi="Bodoni MT" w:cs="Bodoni MT"/>
+        </w:rPr>
         <w:drawing>
           <wp:inline distT="0" distB="0" distL="114300" distR="114300">
             <wp:extent cx="4806950" cy="228600"/>
@@ -8717,6 +8795,9 @@
         <w:br w:type="textWrapping"/>
       </w:r>
       <w:r>
+        <w:rPr>
+          <w:rFonts w:hint="default" w:ascii="Bodoni MT" w:hAnsi="Bodoni MT" w:cs="Bodoni MT"/>
+        </w:rPr>
         <w:drawing>
           <wp:inline distT="0" distB="0" distL="114300" distR="114300">
             <wp:extent cx="2308860" cy="243205"/>
@@ -8963,7 +9044,6 @@
         </w:rPr>
         <w:t xml:space="preserve">, and </w:t>
       </w:r>
-      <w:bookmarkStart w:id="0" w:name="_GoBack"/>
       <w:r>
         <w:rPr>
           <w:rFonts w:hint="default" w:ascii="Bodoni MT" w:hAnsi="Bodoni MT" w:eastAsia="等线" w:cs="Bodoni MT"/>
@@ -8978,7 +9058,6 @@
         </w:rPr>
         <w:t xml:space="preserve">connecting them to the cluster </w:t>
       </w:r>
-      <w:bookmarkEnd w:id="0"/>
       <w:r>
         <w:rPr>
           <w:rFonts w:hint="default" w:ascii="Bodoni MT" w:hAnsi="Bodoni MT" w:eastAsia="等线" w:cs="Bodoni MT"/>
@@ -8989,6 +9068,674 @@
           <w:lang w:val="en-IN"/>
         </w:rPr>
         <w:t>network using plugins.</w:t>
+      </w:r>
+    </w:p>
+    <w:p>
+      <w:pPr>
+        <w:keepNext w:val="0"/>
+        <w:keepLines w:val="0"/>
+        <w:widowControl/>
+        <w:numPr>
+          <w:ilvl w:val="1"/>
+          <w:numId w:val="11"/>
+        </w:numPr>
+        <w:suppressLineNumbers w:val="0"/>
+        <w:spacing w:before="0" w:beforeAutospacing="0" w:after="0" w:afterAutospacing="0" w:line="360" w:lineRule="auto"/>
+        <w:ind w:left="840" w:leftChars="0" w:right="0" w:hanging="420" w:firstLineChars="0"/>
+        <w:jc w:val="left"/>
+        <w:rPr>
+          <w:rFonts w:hint="default" w:ascii="Bodoni MT" w:hAnsi="Bodoni MT" w:eastAsia="等线" w:cs="Bodoni MT"/>
+          <w:sz w:val="22"/>
+          <w:szCs w:val="22"/>
+        </w:rPr>
+      </w:pPr>
+      <w:r>
+        <w:rPr>
+          <w:rFonts w:hint="default" w:ascii="Bodoni MT" w:hAnsi="Bodoni MT" w:eastAsia="等线" w:cs="Bodoni MT"/>
+          <w:sz w:val="22"/>
+          <w:szCs w:val="22"/>
+          <w:lang w:val="en-US"/>
+        </w:rPr>
+        <w:t>In context of AWS, how VPC and CNI work together and how K-Proxy work in this case?</w:t>
+      </w:r>
+    </w:p>
+    <w:p>
+      <w:pPr>
+        <w:keepNext w:val="0"/>
+        <w:keepLines w:val="0"/>
+        <w:widowControl/>
+        <w:numPr>
+          <w:ilvl w:val="2"/>
+          <w:numId w:val="11"/>
+        </w:numPr>
+        <w:suppressLineNumbers w:val="0"/>
+        <w:spacing w:before="0" w:beforeAutospacing="0" w:after="0" w:afterAutospacing="0" w:line="360" w:lineRule="auto"/>
+        <w:ind w:left="1260" w:leftChars="0" w:right="0" w:hanging="420" w:firstLineChars="0"/>
+        <w:jc w:val="left"/>
+        <w:rPr>
+          <w:rFonts w:hint="default" w:ascii="Bodoni MT" w:hAnsi="Bodoni MT" w:eastAsia="等线" w:cs="Bodoni MT"/>
+          <w:sz w:val="22"/>
+          <w:szCs w:val="22"/>
+        </w:rPr>
+      </w:pPr>
+      <w:r>
+        <w:rPr>
+          <w:rFonts w:hint="default" w:ascii="Bodoni MT" w:hAnsi="Bodoni MT" w:eastAsia="等线" w:cs="Bodoni MT"/>
+          <w:sz w:val="22"/>
+          <w:szCs w:val="22"/>
+          <w:lang w:val="en-US"/>
+        </w:rPr>
+        <w:t xml:space="preserve">First thing is, CNI is there to </w:t>
+      </w:r>
+      <w:r>
+        <w:rPr>
+          <w:rFonts w:hint="default" w:ascii="Bodoni MT" w:hAnsi="Bodoni MT" w:eastAsia="等线" w:cs="Bodoni MT"/>
+          <w:color w:val="C00000"/>
+          <w:sz w:val="22"/>
+          <w:szCs w:val="22"/>
+          <w:shd w:val="clear" w:color="auto" w:fill="auto"/>
+          <w:lang w:val="en-US"/>
+        </w:rPr>
+        <w:t>assign IP</w:t>
+      </w:r>
+      <w:r>
+        <w:rPr>
+          <w:rFonts w:hint="default" w:ascii="Bodoni MT" w:hAnsi="Bodoni MT" w:eastAsia="等线" w:cs="Bodoni MT"/>
+          <w:sz w:val="22"/>
+          <w:szCs w:val="22"/>
+          <w:lang w:val="en-US"/>
+        </w:rPr>
+        <w:t xml:space="preserve"> to the pods where as K-Proxy is there to</w:t>
+      </w:r>
+      <w:r>
+        <w:rPr>
+          <w:rFonts w:hint="default" w:ascii="Bodoni MT" w:hAnsi="Bodoni MT" w:eastAsia="等线" w:cs="Bodoni MT"/>
+          <w:color w:val="C00000"/>
+          <w:sz w:val="22"/>
+          <w:szCs w:val="22"/>
+          <w:lang w:val="en-US"/>
+        </w:rPr>
+        <w:t xml:space="preserve"> select the pods to which the request will be forwarded</w:t>
+      </w:r>
+      <w:r>
+        <w:rPr>
+          <w:rFonts w:hint="default" w:ascii="Bodoni MT" w:hAnsi="Bodoni MT" w:eastAsia="等线" w:cs="Bodoni MT"/>
+          <w:sz w:val="22"/>
+          <w:szCs w:val="22"/>
+          <w:lang w:val="en-US"/>
+        </w:rPr>
+        <w:t>.</w:t>
+      </w:r>
+      <w:r>
+        <w:rPr>
+          <w:rFonts w:hint="default" w:ascii="Bodoni MT" w:hAnsi="Bodoni MT" w:eastAsia="等线" w:cs="Bodoni MT"/>
+          <w:sz w:val="22"/>
+          <w:szCs w:val="22"/>
+          <w:lang w:val="en-US"/>
+        </w:rPr>
+        <w:br w:type="textWrapping"/>
+      </w:r>
+      <w:r>
+        <w:rPr>
+          <w:rFonts w:hint="default" w:ascii="Bodoni MT" w:hAnsi="Bodoni MT" w:eastAsia="等线" w:cs="Bodoni MT"/>
+          <w:sz w:val="22"/>
+          <w:szCs w:val="22"/>
+          <w:lang w:val="en-US"/>
+        </w:rPr>
+        <w:t>Both have different purpose.</w:t>
+      </w:r>
+    </w:p>
+    <w:p>
+      <w:pPr>
+        <w:keepNext w:val="0"/>
+        <w:keepLines w:val="0"/>
+        <w:widowControl/>
+        <w:numPr>
+          <w:ilvl w:val="2"/>
+          <w:numId w:val="11"/>
+        </w:numPr>
+        <w:suppressLineNumbers w:val="0"/>
+        <w:spacing w:before="0" w:beforeAutospacing="0" w:after="0" w:afterAutospacing="0" w:line="360" w:lineRule="auto"/>
+        <w:ind w:left="1260" w:leftChars="0" w:right="0" w:hanging="420" w:firstLineChars="0"/>
+        <w:jc w:val="left"/>
+        <w:rPr>
+          <w:rFonts w:hint="default" w:ascii="Bodoni MT" w:hAnsi="Bodoni MT" w:eastAsia="等线" w:cs="Bodoni MT"/>
+          <w:sz w:val="22"/>
+          <w:szCs w:val="22"/>
+        </w:rPr>
+      </w:pPr>
+      <w:r>
+        <w:rPr>
+          <w:rFonts w:hint="default" w:ascii="Bodoni MT" w:hAnsi="Bodoni MT" w:eastAsia="等线" w:cs="Bodoni MT"/>
+          <w:sz w:val="22"/>
+          <w:szCs w:val="22"/>
+          <w:lang w:val="en-US"/>
+        </w:rPr>
+        <w:t>In AWS, each EC2 instances gets a set of IP from the VPC subnets like</w:t>
+      </w:r>
+      <w:r>
+        <w:rPr>
+          <w:rFonts w:hint="default" w:ascii="Bodoni MT" w:hAnsi="Bodoni MT" w:eastAsia="等线" w:cs="Bodoni MT"/>
+          <w:sz w:val="22"/>
+          <w:szCs w:val="22"/>
+          <w:lang w:val="en-US"/>
+        </w:rPr>
+        <w:br w:type="textWrapping"/>
+      </w:r>
+      <w:r>
+        <w:rPr>
+          <w:rFonts w:hint="default" w:ascii="Bodoni MT" w:hAnsi="Bodoni MT" w:eastAsia="等线" w:cs="Bodoni MT"/>
+          <w:sz w:val="22"/>
+          <w:szCs w:val="22"/>
+          <w:lang w:val="en-US"/>
+        </w:rPr>
+        <w:t>10.0.0.10, 10.0.0.11 … (Node-1)</w:t>
+      </w:r>
+      <w:r>
+        <w:rPr>
+          <w:rFonts w:hint="default" w:ascii="Bodoni MT" w:hAnsi="Bodoni MT" w:eastAsia="等线" w:cs="Bodoni MT"/>
+          <w:sz w:val="22"/>
+          <w:szCs w:val="22"/>
+          <w:lang w:val="en-US"/>
+        </w:rPr>
+        <w:br w:type="textWrapping"/>
+      </w:r>
+      <w:r>
+        <w:rPr>
+          <w:rFonts w:hint="default" w:ascii="Bodoni MT" w:hAnsi="Bodoni MT" w:eastAsia="等线" w:cs="Bodoni MT"/>
+          <w:sz w:val="22"/>
+          <w:szCs w:val="22"/>
+          <w:lang w:val="en-US"/>
+        </w:rPr>
+        <w:t>10.0.0.20, 10.0.0.21 … (Node-2) ..etc</w:t>
+      </w:r>
+    </w:p>
+    <w:p>
+      <w:pPr>
+        <w:keepNext w:val="0"/>
+        <w:keepLines w:val="0"/>
+        <w:widowControl/>
+        <w:numPr>
+          <w:ilvl w:val="3"/>
+          <w:numId w:val="11"/>
+        </w:numPr>
+        <w:suppressLineNumbers w:val="0"/>
+        <w:spacing w:before="0" w:beforeAutospacing="0" w:after="0" w:afterAutospacing="0" w:line="360" w:lineRule="auto"/>
+        <w:ind w:left="1680" w:leftChars="0" w:right="0" w:hanging="420" w:firstLineChars="0"/>
+        <w:jc w:val="left"/>
+        <w:rPr>
+          <w:rFonts w:hint="default" w:ascii="Bodoni MT" w:hAnsi="Bodoni MT" w:eastAsia="等线" w:cs="Bodoni MT"/>
+          <w:sz w:val="22"/>
+          <w:szCs w:val="22"/>
+        </w:rPr>
+      </w:pPr>
+      <w:r>
+        <w:rPr>
+          <w:rFonts w:hint="default" w:ascii="Bodoni MT" w:hAnsi="Bodoni MT" w:eastAsia="等线" w:cs="Bodoni MT"/>
+          <w:sz w:val="22"/>
+          <w:szCs w:val="22"/>
+          <w:lang w:val="en-US"/>
+        </w:rPr>
+        <w:t>And from these set of IPs, the pods will get one one IP.</w:t>
+      </w:r>
+    </w:p>
+    <w:p>
+      <w:pPr>
+        <w:keepNext w:val="0"/>
+        <w:keepLines w:val="0"/>
+        <w:widowControl/>
+        <w:numPr>
+          <w:ilvl w:val="3"/>
+          <w:numId w:val="11"/>
+        </w:numPr>
+        <w:suppressLineNumbers w:val="0"/>
+        <w:spacing w:before="0" w:beforeAutospacing="0" w:after="0" w:afterAutospacing="0" w:line="360" w:lineRule="auto"/>
+        <w:ind w:left="1680" w:leftChars="0" w:right="0" w:hanging="420" w:firstLineChars="0"/>
+        <w:jc w:val="left"/>
+        <w:rPr>
+          <w:rFonts w:hint="default" w:ascii="Bodoni MT" w:hAnsi="Bodoni MT" w:eastAsia="等线" w:cs="Bodoni MT"/>
+          <w:sz w:val="22"/>
+          <w:szCs w:val="22"/>
+        </w:rPr>
+      </w:pPr>
+      <w:r>
+        <w:rPr>
+          <w:rFonts w:hint="default" w:ascii="Bodoni MT" w:hAnsi="Bodoni MT" w:eastAsia="等线" w:cs="Bodoni MT"/>
+          <w:sz w:val="22"/>
+          <w:szCs w:val="22"/>
+          <w:lang w:val="en-US"/>
+        </w:rPr>
+        <w:t>The pods should not be called using their IPs directly, because Pods are dynamic and can be deleted and created depending upon the requirements.</w:t>
+      </w:r>
+      <w:r>
+        <w:rPr>
+          <w:rFonts w:hint="default" w:ascii="Bodoni MT" w:hAnsi="Bodoni MT" w:eastAsia="等线" w:cs="Bodoni MT"/>
+          <w:sz w:val="22"/>
+          <w:szCs w:val="22"/>
+          <w:lang w:val="en-US"/>
+        </w:rPr>
+        <w:br w:type="textWrapping"/>
+      </w:r>
+      <w:r>
+        <w:rPr>
+          <w:rFonts w:hint="default" w:ascii="Bodoni MT" w:hAnsi="Bodoni MT" w:eastAsia="等线" w:cs="Bodoni MT"/>
+          <w:sz w:val="22"/>
+          <w:szCs w:val="22"/>
+          <w:lang w:val="en-US"/>
+        </w:rPr>
+        <w:t>So, it should be called using the services only.</w:t>
+      </w:r>
+    </w:p>
+    <w:p>
+      <w:pPr>
+        <w:keepNext w:val="0"/>
+        <w:keepLines w:val="0"/>
+        <w:widowControl/>
+        <w:numPr>
+          <w:ilvl w:val="2"/>
+          <w:numId w:val="11"/>
+        </w:numPr>
+        <w:suppressLineNumbers w:val="0"/>
+        <w:spacing w:before="0" w:beforeAutospacing="0" w:after="0" w:afterAutospacing="0" w:line="360" w:lineRule="auto"/>
+        <w:ind w:left="1260" w:leftChars="0" w:right="0" w:hanging="420" w:firstLineChars="0"/>
+        <w:jc w:val="left"/>
+        <w:rPr>
+          <w:rFonts w:hint="default" w:ascii="Bodoni MT" w:hAnsi="Bodoni MT" w:eastAsia="等线" w:cs="Bodoni MT"/>
+          <w:sz w:val="22"/>
+          <w:szCs w:val="22"/>
+        </w:rPr>
+      </w:pPr>
+      <w:r>
+        <w:rPr>
+          <w:rFonts w:hint="default" w:ascii="Bodoni MT" w:hAnsi="Bodoni MT" w:eastAsia="等线" w:cs="Bodoni MT"/>
+          <w:sz w:val="22"/>
+          <w:szCs w:val="22"/>
+          <w:lang w:val="en-US"/>
+        </w:rPr>
+        <w:t xml:space="preserve">User </w:t>
+      </w:r>
+      <w:r>
+        <w:rPr>
+          <w:rFonts w:hint="default" w:ascii="Bodoni MT" w:hAnsi="Bodoni MT" w:eastAsia="等线" w:cs="Bodoni MT"/>
+          <w:sz w:val="22"/>
+          <w:szCs w:val="22"/>
+          <w:lang w:val="en-US"/>
+        </w:rPr>
+        <w:t>→ ELB → EC2 (worker node) → Pods</w:t>
+      </w:r>
+    </w:p>
+    <w:p>
+      <w:pPr>
+        <w:keepNext w:val="0"/>
+        <w:keepLines w:val="0"/>
+        <w:widowControl/>
+        <w:numPr>
+          <w:ilvl w:val="1"/>
+          <w:numId w:val="11"/>
+        </w:numPr>
+        <w:suppressLineNumbers w:val="0"/>
+        <w:spacing w:before="0" w:beforeAutospacing="0" w:after="0" w:afterAutospacing="0" w:line="360" w:lineRule="auto"/>
+        <w:ind w:left="840" w:leftChars="0" w:right="0" w:hanging="420" w:firstLineChars="0"/>
+        <w:jc w:val="left"/>
+        <w:rPr>
+          <w:rFonts w:hint="default" w:ascii="Bodoni MT" w:hAnsi="Bodoni MT" w:eastAsia="等线" w:cs="Bodoni MT"/>
+          <w:sz w:val="22"/>
+          <w:szCs w:val="22"/>
+        </w:rPr>
+      </w:pPr>
+      <w:r>
+        <w:rPr>
+          <w:rFonts w:hint="default" w:ascii="Bodoni MT" w:hAnsi="Bodoni MT" w:eastAsia="等线" w:cs="Bodoni MT"/>
+          <w:color w:val="C00000"/>
+          <w:sz w:val="22"/>
+          <w:szCs w:val="22"/>
+          <w:shd w:val="clear" w:color="FFFFFF" w:fill="D9D9D9"/>
+          <w:lang w:val="en-US"/>
+        </w:rPr>
+        <w:t>Kube-proxy continuously watches the cluster and updates iptables rules.</w:t>
+      </w:r>
+      <w:r>
+        <w:rPr>
+          <w:rFonts w:hint="default" w:ascii="Bodoni MT" w:hAnsi="Bodoni MT" w:eastAsia="等线" w:cs="Bodoni MT"/>
+          <w:color w:val="C00000"/>
+          <w:sz w:val="22"/>
+          <w:szCs w:val="22"/>
+          <w:shd w:val="clear" w:color="FFFFFF" w:fill="D9D9D9"/>
+          <w:lang w:val="en-US"/>
+        </w:rPr>
+        <w:br w:type="textWrapping"/>
+      </w:r>
+      <w:r>
+        <w:rPr>
+          <w:rFonts w:hint="default" w:ascii="Bodoni MT" w:hAnsi="Bodoni MT" w:eastAsia="等线" w:cs="Bodoni MT"/>
+          <w:color w:val="C00000"/>
+          <w:sz w:val="22"/>
+          <w:szCs w:val="22"/>
+          <w:shd w:val="clear" w:color="FFFFFF" w:fill="D9D9D9"/>
+          <w:lang w:val="en-US"/>
+        </w:rPr>
+        <w:t>Actual traffic forwarding is done by the OS using those rules</w:t>
+      </w:r>
+      <w:r>
+        <w:rPr>
+          <w:rFonts w:hint="default" w:ascii="Bodoni MT" w:hAnsi="Bodoni MT" w:eastAsia="等线" w:cs="Bodoni MT"/>
+          <w:sz w:val="22"/>
+          <w:szCs w:val="22"/>
+          <w:lang w:val="en-US"/>
+        </w:rPr>
+        <w:br w:type="textWrapping"/>
+      </w:r>
+      <w:r>
+        <w:rPr>
+          <w:rFonts w:hint="default" w:ascii="Bodoni MT" w:hAnsi="Bodoni MT" w:eastAsia="等线" w:cs="Bodoni MT"/>
+          <w:sz w:val="22"/>
+          <w:szCs w:val="22"/>
+          <w:lang w:val="en-US"/>
+        </w:rPr>
+        <w:t>Its like, K-Proxy writes the rulebook, Kernel execute that.</w:t>
+      </w:r>
+    </w:p>
+    <w:p>
+      <w:pPr>
+        <w:keepNext w:val="0"/>
+        <w:keepLines w:val="0"/>
+        <w:widowControl/>
+        <w:numPr>
+          <w:ilvl w:val="1"/>
+          <w:numId w:val="11"/>
+        </w:numPr>
+        <w:suppressLineNumbers w:val="0"/>
+        <w:spacing w:before="0" w:beforeAutospacing="0" w:after="0" w:afterAutospacing="0" w:line="360" w:lineRule="auto"/>
+        <w:ind w:left="840" w:leftChars="0" w:right="0" w:hanging="420" w:firstLineChars="0"/>
+        <w:jc w:val="left"/>
+        <w:rPr>
+          <w:rFonts w:hint="default" w:ascii="Bodoni MT" w:hAnsi="Bodoni MT" w:eastAsia="等线" w:cs="Bodoni MT"/>
+          <w:sz w:val="22"/>
+          <w:szCs w:val="22"/>
+        </w:rPr>
+      </w:pPr>
+      <w:r>
+        <w:rPr>
+          <w:rFonts w:hint="default" w:ascii="Bodoni MT" w:hAnsi="Bodoni MT" w:eastAsia="等线" w:cs="Bodoni MT"/>
+          <w:sz w:val="22"/>
+          <w:szCs w:val="22"/>
+          <w:lang w:val="en-US"/>
+        </w:rPr>
+        <w:t xml:space="preserve">One more thing, </w:t>
+      </w:r>
+      <w:r>
+        <w:rPr>
+          <w:rFonts w:hint="default" w:ascii="Bodoni MT" w:hAnsi="Bodoni MT" w:eastAsia="等线" w:cs="Bodoni MT"/>
+          <w:color w:val="002060"/>
+          <w:sz w:val="22"/>
+          <w:szCs w:val="22"/>
+          <w:shd w:val="clear" w:color="FFFFFF" w:fill="D9D9D9"/>
+          <w:lang w:val="en-US"/>
+        </w:rPr>
+        <w:t>Load Balancer is not part of the Kubernetes cluster. But the K-Proxy is.</w:t>
+      </w:r>
+      <w:r>
+        <w:rPr>
+          <w:rFonts w:hint="default" w:ascii="Bodoni MT" w:hAnsi="Bodoni MT" w:eastAsia="等线" w:cs="Bodoni MT"/>
+          <w:color w:val="002060"/>
+          <w:sz w:val="22"/>
+          <w:szCs w:val="22"/>
+          <w:shd w:val="clear" w:color="FFFFFF" w:fill="D9D9D9"/>
+          <w:lang w:val="en-US"/>
+        </w:rPr>
+        <w:br w:type="textWrapping"/>
+      </w:r>
+      <w:r>
+        <w:rPr>
+          <w:rFonts w:hint="default" w:ascii="Bodoni MT" w:hAnsi="Bodoni MT" w:eastAsia="等线" w:cs="Bodoni MT"/>
+          <w:color w:val="002060"/>
+          <w:sz w:val="22"/>
+          <w:szCs w:val="22"/>
+          <w:shd w:val="clear" w:color="FFFFFF" w:fill="D9D9D9"/>
+          <w:lang w:val="en-US"/>
+        </w:rPr>
+        <w:t>User ----- (EC2)Node’s port   (outside of kubernetes cluster)</w:t>
+      </w:r>
+      <w:r>
+        <w:rPr>
+          <w:rFonts w:hint="default" w:ascii="Bodoni MT" w:hAnsi="Bodoni MT" w:eastAsia="等线" w:cs="Bodoni MT"/>
+          <w:color w:val="002060"/>
+          <w:sz w:val="22"/>
+          <w:szCs w:val="22"/>
+          <w:shd w:val="clear" w:color="FFFFFF" w:fill="D9D9D9"/>
+          <w:lang w:val="en-US"/>
+        </w:rPr>
+        <w:br w:type="textWrapping"/>
+      </w:r>
+      <w:r>
+        <w:rPr>
+          <w:rFonts w:hint="default" w:ascii="Bodoni MT" w:hAnsi="Bodoni MT" w:eastAsia="等线" w:cs="Bodoni MT"/>
+          <w:color w:val="002060"/>
+          <w:sz w:val="22"/>
+          <w:szCs w:val="22"/>
+          <w:shd w:val="clear" w:color="auto" w:fill="auto"/>
+          <w:lang w:val="en-US"/>
+        </w:rPr>
+        <w:tab/>
+      </w:r>
+      <w:r>
+        <w:rPr>
+          <w:rFonts w:hint="default" w:ascii="Bodoni MT" w:hAnsi="Bodoni MT" w:eastAsia="等线" w:cs="Bodoni MT"/>
+          <w:color w:val="002060"/>
+          <w:sz w:val="22"/>
+          <w:szCs w:val="22"/>
+          <w:shd w:val="clear" w:color="FFFFFF" w:fill="D9D9D9"/>
+          <w:lang w:val="en-US"/>
+        </w:rPr>
+        <w:t>After getting into the node, the K-Proxy will route to the matching pod and you can access the application.</w:t>
+      </w:r>
+      <w:r>
+        <w:rPr>
+          <w:rFonts w:hint="default" w:ascii="Bodoni MT" w:hAnsi="Bodoni MT" w:eastAsia="等线" w:cs="Bodoni MT"/>
+          <w:color w:val="002060"/>
+          <w:sz w:val="22"/>
+          <w:szCs w:val="22"/>
+          <w:shd w:val="clear" w:color="FFFFFF" w:fill="D9D9D9"/>
+          <w:lang w:val="en-US"/>
+        </w:rPr>
+        <w:br w:type="textWrapping"/>
+      </w:r>
+      <w:r>
+        <w:rPr>
+          <w:rFonts w:hint="default" w:ascii="Bodoni MT" w:hAnsi="Bodoni MT" w:eastAsia="等线" w:cs="Bodoni MT"/>
+          <w:color w:val="002060"/>
+          <w:sz w:val="22"/>
+          <w:szCs w:val="22"/>
+          <w:shd w:val="clear" w:color="auto" w:fill="auto"/>
+          <w:lang w:val="en-US"/>
+        </w:rPr>
+        <w:tab/>
+      </w:r>
+      <w:r>
+        <w:rPr>
+          <w:rFonts w:hint="default" w:ascii="Bodoni MT" w:hAnsi="Bodoni MT" w:eastAsia="等线" w:cs="Bodoni MT"/>
+          <w:color w:val="C00000"/>
+          <w:sz w:val="22"/>
+          <w:szCs w:val="22"/>
+          <w:shd w:val="clear" w:color="auto" w:fill="auto"/>
+          <w:lang w:val="en-US"/>
+        </w:rPr>
+        <w:t>Matching pod means, if the request is for order service, and multiple services are running on different pods like payment service, inventory service, then the request will be forwarded only the pods running order service</w:t>
+      </w:r>
+      <w:r>
+        <w:rPr>
+          <w:rFonts w:hint="default" w:ascii="Bodoni MT" w:hAnsi="Bodoni MT" w:eastAsia="等线" w:cs="Bodoni MT"/>
+          <w:color w:val="002060"/>
+          <w:sz w:val="22"/>
+          <w:szCs w:val="22"/>
+          <w:shd w:val="clear" w:color="auto" w:fill="auto"/>
+          <w:lang w:val="en-US"/>
+        </w:rPr>
+        <w:t>.</w:t>
+      </w:r>
+    </w:p>
+    <w:p>
+      <w:pPr>
+        <w:keepNext w:val="0"/>
+        <w:keepLines w:val="0"/>
+        <w:widowControl/>
+        <w:numPr>
+          <w:ilvl w:val="1"/>
+          <w:numId w:val="11"/>
+        </w:numPr>
+        <w:suppressLineNumbers w:val="0"/>
+        <w:spacing w:before="0" w:beforeAutospacing="0" w:after="0" w:afterAutospacing="0" w:line="360" w:lineRule="auto"/>
+        <w:ind w:left="840" w:leftChars="0" w:right="0" w:hanging="420" w:firstLineChars="0"/>
+        <w:jc w:val="left"/>
+        <w:rPr>
+          <w:rFonts w:hint="default" w:ascii="Bodoni MT" w:hAnsi="Bodoni MT" w:eastAsia="等线" w:cs="Bodoni MT"/>
+          <w:sz w:val="22"/>
+          <w:szCs w:val="22"/>
+        </w:rPr>
+      </w:pPr>
+      <w:r>
+        <w:rPr>
+          <w:rFonts w:hint="default" w:ascii="Bodoni MT" w:hAnsi="Bodoni MT" w:eastAsia="等线" w:cs="Bodoni MT"/>
+          <w:sz w:val="22"/>
+          <w:szCs w:val="22"/>
+        </w:rPr>
+        <w:t>User → Load balancer → Node</w:t>
+      </w:r>
+      <w:r>
+        <w:rPr>
+          <w:rFonts w:hint="default" w:ascii="Bodoni MT" w:hAnsi="Bodoni MT" w:eastAsia="等线" w:cs="Bodoni MT"/>
+          <w:sz w:val="22"/>
+          <w:szCs w:val="22"/>
+          <w:lang w:val="en-US"/>
+        </w:rPr>
+        <w:t xml:space="preserve"> </w:t>
+      </w:r>
+      <w:r>
+        <w:rPr>
+          <w:rFonts w:hint="default" w:ascii="Bodoni MT" w:hAnsi="Bodoni MT" w:eastAsia="等线" w:cs="Bodoni MT"/>
+          <w:sz w:val="22"/>
+          <w:szCs w:val="22"/>
+        </w:rPr>
+        <w:t>→ K Proxy</w:t>
+      </w:r>
+      <w:r>
+        <w:rPr>
+          <w:rFonts w:hint="default" w:ascii="Bodoni MT" w:hAnsi="Bodoni MT" w:eastAsia="等线" w:cs="Bodoni MT"/>
+          <w:sz w:val="22"/>
+          <w:szCs w:val="22"/>
+          <w:lang w:val="en-US"/>
+        </w:rPr>
+        <w:t xml:space="preserve"> →</w:t>
+      </w:r>
+      <w:r>
+        <w:rPr>
+          <w:rFonts w:hint="default" w:ascii="Bodoni MT" w:hAnsi="Bodoni MT" w:eastAsia="等线" w:cs="Bodoni MT"/>
+          <w:sz w:val="22"/>
+          <w:szCs w:val="22"/>
+        </w:rPr>
+        <w:t xml:space="preserve"> Pod</w:t>
+      </w:r>
+    </w:p>
+    <w:p>
+      <w:pPr>
+        <w:keepNext w:val="0"/>
+        <w:keepLines w:val="0"/>
+        <w:widowControl/>
+        <w:numPr>
+          <w:ilvl w:val="1"/>
+          <w:numId w:val="11"/>
+        </w:numPr>
+        <w:suppressLineNumbers w:val="0"/>
+        <w:spacing w:before="0" w:beforeAutospacing="0" w:after="0" w:afterAutospacing="0" w:line="360" w:lineRule="auto"/>
+        <w:ind w:left="840" w:leftChars="0" w:right="0" w:hanging="420" w:firstLineChars="0"/>
+        <w:jc w:val="left"/>
+        <w:rPr>
+          <w:rFonts w:hint="default" w:ascii="Bodoni MT" w:hAnsi="Bodoni MT" w:eastAsia="等线" w:cs="Bodoni MT"/>
+          <w:sz w:val="22"/>
+          <w:szCs w:val="22"/>
+        </w:rPr>
+      </w:pPr>
+      <w:r>
+        <w:rPr>
+          <w:rFonts w:hint="default" w:ascii="Bodoni MT" w:hAnsi="Bodoni MT" w:cs="Bodoni MT"/>
+        </w:rPr>
+        <w:drawing>
+          <wp:inline distT="0" distB="0" distL="114300" distR="114300">
+            <wp:extent cx="3874135" cy="1510030"/>
+            <wp:effectExtent l="0" t="0" r="12065" b="1270"/>
+            <wp:docPr id="6" name="Picture 1"/>
+            <wp:cNvGraphicFramePr>
+              <a:graphicFrameLocks xmlns:a="http://schemas.openxmlformats.org/drawingml/2006/main" noChangeAspect="1"/>
+            </wp:cNvGraphicFramePr>
+            <a:graphic xmlns:a="http://schemas.openxmlformats.org/drawingml/2006/main">
+              <a:graphicData uri="http://schemas.openxmlformats.org/drawingml/2006/picture">
+                <pic:pic xmlns:pic="http://schemas.openxmlformats.org/drawingml/2006/picture">
+                  <pic:nvPicPr>
+                    <pic:cNvPr id="6" name="Picture 1"/>
+                    <pic:cNvPicPr>
+                      <a:picLocks noChangeAspect="1"/>
+                    </pic:cNvPicPr>
+                  </pic:nvPicPr>
+                  <pic:blipFill>
+                    <a:blip r:embed="rId9"/>
+                    <a:stretch>
+                      <a:fillRect/>
+                    </a:stretch>
+                  </pic:blipFill>
+                  <pic:spPr>
+                    <a:xfrm>
+                      <a:off x="0" y="0"/>
+                      <a:ext cx="3874135" cy="1510030"/>
+                    </a:xfrm>
+                    <a:prstGeom prst="rect">
+                      <a:avLst/>
+                    </a:prstGeom>
+                    <a:noFill/>
+                    <a:ln>
+                      <a:noFill/>
+                    </a:ln>
+                  </pic:spPr>
+                </pic:pic>
+              </a:graphicData>
+            </a:graphic>
+          </wp:inline>
+        </w:drawing>
+      </w:r>
+      <w:r>
+        <w:rPr>
+          <w:rFonts w:hint="default" w:ascii="Bodoni MT" w:hAnsi="Bodoni MT" w:cs="Bodoni MT"/>
+        </w:rPr>
+        <w:br w:type="textWrapping"/>
+      </w:r>
+      <w:r>
+        <w:rPr>
+          <w:rFonts w:hint="default" w:ascii="Bodoni MT" w:hAnsi="Bodoni MT" w:cs="Bodoni MT"/>
+          <w:b/>
+          <w:bCs/>
+          <w:color w:val="FFFFFF" w:themeColor="background1"/>
+          <w:highlight w:val="darkMagenta"/>
+          <w:lang w:val="en-US"/>
+          <w14:textFill>
+            <w14:solidFill>
+              <w14:schemeClr w14:val="bg1"/>
+            </w14:solidFill>
+          </w14:textFill>
+        </w:rPr>
+        <w:t xml:space="preserve">Kubelet </w:t>
+      </w:r>
+      <w:r>
+        <w:rPr>
+          <w:rFonts w:hint="default" w:ascii="Bodoni MT" w:hAnsi="Bodoni MT" w:cs="Bodoni MT"/>
+          <w:color w:val="FFFFFF" w:themeColor="background1"/>
+          <w:highlight w:val="darkMagenta"/>
+          <w:lang w:val="en-US"/>
+          <w14:textFill>
+            <w14:solidFill>
+              <w14:schemeClr w14:val="bg1"/>
+            </w14:solidFill>
+          </w14:textFill>
+        </w:rPr>
+        <w:t>calls CNI plugin.</w:t>
       </w:r>
     </w:p>
     <w:p>
@@ -9008,18 +9755,337 @@
           <w:rFonts w:hint="default" w:ascii="Bodoni MT" w:hAnsi="Bodoni MT" w:eastAsia="等线" w:cs="Bodoni MT"/>
           <w:sz w:val="22"/>
           <w:szCs w:val="22"/>
-        </w:rPr>
-      </w:pPr>
-      <w:r>
-        <w:rPr>
-          <w:rFonts w:hint="default" w:ascii="Bodoni MT" w:hAnsi="Bodoni MT" w:eastAsia="等线" w:cs="Bodoni MT"/>
-          <w:color w:val="auto"/>
-          <w:kern w:val="0"/>
-          <w:sz w:val="22"/>
-          <w:szCs w:val="22"/>
-          <w:lang w:val="en-IN" w:eastAsia="zh-CN" w:bidi="ar"/>
-        </w:rPr>
-        <w:t>F</w:t>
+          <w:u w:val="single"/>
+        </w:rPr>
+      </w:pPr>
+      <w:r>
+        <w:rPr>
+          <w:rFonts w:hint="default" w:ascii="Bodoni MT" w:hAnsi="Bodoni MT" w:eastAsia="等线" w:cs="Bodoni MT"/>
+          <w:b/>
+          <w:bCs/>
+          <w:sz w:val="22"/>
+          <w:szCs w:val="22"/>
+          <w:u w:val="single"/>
+          <w:lang w:val="en-US"/>
+        </w:rPr>
+        <w:t>CSI</w:t>
+      </w:r>
+      <w:r>
+        <w:rPr>
+          <w:rFonts w:hint="default" w:ascii="Bodoni MT" w:hAnsi="Bodoni MT" w:eastAsia="等线" w:cs="Bodoni MT"/>
+          <w:b w:val="0"/>
+          <w:bCs w:val="0"/>
+          <w:sz w:val="22"/>
+          <w:szCs w:val="22"/>
+          <w:u w:val="single"/>
+          <w:lang w:val="en-US"/>
+        </w:rPr>
+        <w:t xml:space="preserve"> (Container Storate Interface)</w:t>
+      </w:r>
+    </w:p>
+    <w:p>
+      <w:pPr>
+        <w:keepNext w:val="0"/>
+        <w:keepLines w:val="0"/>
+        <w:widowControl/>
+        <w:numPr>
+          <w:ilvl w:val="1"/>
+          <w:numId w:val="11"/>
+        </w:numPr>
+        <w:suppressLineNumbers w:val="0"/>
+        <w:spacing w:before="0" w:beforeAutospacing="0" w:after="0" w:afterAutospacing="0" w:line="360" w:lineRule="auto"/>
+        <w:ind w:left="840" w:leftChars="0" w:right="0" w:hanging="420" w:firstLineChars="0"/>
+        <w:jc w:val="left"/>
+        <w:rPr>
+          <w:rFonts w:hint="default" w:ascii="Bodoni MT" w:hAnsi="Bodoni MT" w:eastAsia="等线" w:cs="Bodoni MT"/>
+          <w:sz w:val="22"/>
+          <w:szCs w:val="22"/>
+        </w:rPr>
+      </w:pPr>
+      <w:r>
+        <w:rPr>
+          <w:rFonts w:hint="default" w:ascii="Bodoni MT" w:hAnsi="Bodoni MT" w:eastAsia="等线" w:cs="Bodoni MT"/>
+          <w:sz w:val="22"/>
+          <w:szCs w:val="22"/>
+          <w:lang w:val="en-US"/>
+        </w:rPr>
+        <w:t xml:space="preserve">In this, both </w:t>
+      </w:r>
+      <w:r>
+        <w:rPr>
+          <w:rFonts w:hint="default" w:ascii="Bodoni MT" w:hAnsi="Bodoni MT" w:eastAsia="等线" w:cs="Bodoni MT"/>
+          <w:b/>
+          <w:bCs/>
+          <w:sz w:val="22"/>
+          <w:szCs w:val="22"/>
+          <w:lang w:val="en-US"/>
+        </w:rPr>
+        <w:t>Control plane + Kubelet</w:t>
+      </w:r>
+      <w:r>
+        <w:rPr>
+          <w:rFonts w:hint="default" w:ascii="Bodoni MT" w:hAnsi="Bodoni MT" w:eastAsia="等线" w:cs="Bodoni MT"/>
+          <w:b w:val="0"/>
+          <w:bCs w:val="0"/>
+          <w:sz w:val="22"/>
+          <w:szCs w:val="22"/>
+          <w:lang w:val="en-US"/>
+        </w:rPr>
+        <w:t xml:space="preserve"> are involved.</w:t>
+      </w:r>
+      <w:r>
+        <w:rPr>
+          <w:rFonts w:hint="default" w:ascii="Bodoni MT" w:hAnsi="Bodoni MT" w:eastAsia="等线" w:cs="Bodoni MT"/>
+          <w:b w:val="0"/>
+          <w:bCs w:val="0"/>
+          <w:sz w:val="22"/>
+          <w:szCs w:val="22"/>
+          <w:lang w:val="en-US"/>
+        </w:rPr>
+        <w:br w:type="textWrapping"/>
+      </w:r>
+      <w:r>
+        <w:rPr>
+          <w:rFonts w:hint="default" w:ascii="Bodoni MT" w:hAnsi="Bodoni MT" w:eastAsia="等线" w:cs="Bodoni MT"/>
+          <w:b w:val="0"/>
+          <w:bCs w:val="0"/>
+          <w:color w:val="0070C0"/>
+          <w:sz w:val="22"/>
+          <w:szCs w:val="22"/>
+          <w:shd w:val="clear" w:color="FFFFFF" w:fill="D9D9D9"/>
+          <w:lang w:val="en-US"/>
+        </w:rPr>
+        <w:t>Control plane uses CSI to create or delete volumes.</w:t>
+      </w:r>
+      <w:r>
+        <w:rPr>
+          <w:rFonts w:hint="default" w:ascii="Bodoni MT" w:hAnsi="Bodoni MT" w:eastAsia="等线" w:cs="Bodoni MT"/>
+          <w:b w:val="0"/>
+          <w:bCs w:val="0"/>
+          <w:color w:val="0070C0"/>
+          <w:sz w:val="22"/>
+          <w:szCs w:val="22"/>
+          <w:shd w:val="clear" w:color="FFFFFF" w:fill="D9D9D9"/>
+          <w:lang w:val="en-US"/>
+        </w:rPr>
+        <w:br w:type="textWrapping"/>
+      </w:r>
+      <w:r>
+        <w:rPr>
+          <w:rFonts w:hint="default" w:ascii="Bodoni MT" w:hAnsi="Bodoni MT" w:eastAsia="等线" w:cs="Bodoni MT"/>
+          <w:b w:val="0"/>
+          <w:bCs w:val="0"/>
+          <w:color w:val="0070C0"/>
+          <w:sz w:val="22"/>
+          <w:szCs w:val="22"/>
+          <w:shd w:val="clear" w:color="FFFFFF" w:fill="D9D9D9"/>
+          <w:lang w:val="en-US"/>
+        </w:rPr>
+        <w:t>Kubelet uses CSI to attach disk to node, and mount to pod.</w:t>
+      </w:r>
+    </w:p>
+    <w:p>
+      <w:pPr>
+        <w:keepNext w:val="0"/>
+        <w:keepLines w:val="0"/>
+        <w:widowControl/>
+        <w:numPr>
+          <w:ilvl w:val="1"/>
+          <w:numId w:val="11"/>
+        </w:numPr>
+        <w:suppressLineNumbers w:val="0"/>
+        <w:spacing w:before="0" w:beforeAutospacing="0" w:after="0" w:afterAutospacing="0" w:line="360" w:lineRule="auto"/>
+        <w:ind w:left="840" w:leftChars="0" w:right="0" w:hanging="420" w:firstLineChars="0"/>
+        <w:jc w:val="left"/>
+        <w:rPr>
+          <w:rFonts w:hint="default" w:ascii="Bodoni MT" w:hAnsi="Bodoni MT" w:eastAsia="等线" w:cs="Bodoni MT"/>
+          <w:sz w:val="22"/>
+          <w:szCs w:val="22"/>
+        </w:rPr>
+      </w:pPr>
+      <w:r>
+        <w:rPr>
+          <w:rFonts w:hint="default" w:ascii="Bodoni MT" w:hAnsi="Bodoni MT" w:eastAsia="等线"/>
+          <w:sz w:val="22"/>
+          <w:szCs w:val="22"/>
+        </w:rPr>
+        <w:t>Kubernetes doesn’t manage storage itself</w:t>
+      </w:r>
+      <w:r>
+        <w:rPr>
+          <w:rFonts w:hint="default" w:ascii="Bodoni MT" w:hAnsi="Bodoni MT" w:eastAsia="等线"/>
+          <w:sz w:val="22"/>
+          <w:szCs w:val="22"/>
+          <w:lang w:val="en-US"/>
+        </w:rPr>
+        <w:t xml:space="preserve">, </w:t>
+      </w:r>
+      <w:r>
+        <w:rPr>
+          <w:rFonts w:hint="default" w:ascii="Bodoni MT" w:hAnsi="Bodoni MT" w:eastAsia="等线"/>
+          <w:sz w:val="22"/>
+          <w:szCs w:val="22"/>
+        </w:rPr>
+        <w:t>It delegates to CSI drivers</w:t>
+      </w:r>
+      <w:r>
+        <w:rPr>
+          <w:rFonts w:hint="default" w:ascii="Bodoni MT" w:hAnsi="Bodoni MT" w:eastAsia="等线"/>
+          <w:sz w:val="22"/>
+          <w:szCs w:val="22"/>
+          <w:lang w:val="en-US"/>
+        </w:rPr>
+        <w:t>.</w:t>
+      </w:r>
+    </w:p>
+    <w:p>
+      <w:pPr>
+        <w:keepNext w:val="0"/>
+        <w:keepLines w:val="0"/>
+        <w:widowControl/>
+        <w:numPr>
+          <w:ilvl w:val="1"/>
+          <w:numId w:val="11"/>
+        </w:numPr>
+        <w:suppressLineNumbers w:val="0"/>
+        <w:spacing w:before="0" w:beforeAutospacing="0" w:after="0" w:afterAutospacing="0" w:line="360" w:lineRule="auto"/>
+        <w:ind w:left="840" w:leftChars="0" w:right="0" w:hanging="420" w:firstLineChars="0"/>
+        <w:jc w:val="left"/>
+        <w:rPr>
+          <w:rFonts w:hint="default" w:ascii="Bodoni MT" w:hAnsi="Bodoni MT" w:eastAsia="等线" w:cs="Bodoni MT"/>
+          <w:sz w:val="22"/>
+          <w:szCs w:val="22"/>
+        </w:rPr>
+      </w:pPr>
+      <w:r>
+        <w:drawing>
+          <wp:inline distT="0" distB="0" distL="114300" distR="114300">
+            <wp:extent cx="3162300" cy="1715770"/>
+            <wp:effectExtent l="0" t="0" r="0" b="11430"/>
+            <wp:docPr id="9" name="Picture 4"/>
+            <wp:cNvGraphicFramePr>
+              <a:graphicFrameLocks xmlns:a="http://schemas.openxmlformats.org/drawingml/2006/main" noChangeAspect="1"/>
+            </wp:cNvGraphicFramePr>
+            <a:graphic xmlns:a="http://schemas.openxmlformats.org/drawingml/2006/main">
+              <a:graphicData uri="http://schemas.openxmlformats.org/drawingml/2006/picture">
+                <pic:pic xmlns:pic="http://schemas.openxmlformats.org/drawingml/2006/picture">
+                  <pic:nvPicPr>
+                    <pic:cNvPr id="9" name="Picture 4"/>
+                    <pic:cNvPicPr>
+                      <a:picLocks noChangeAspect="1"/>
+                    </pic:cNvPicPr>
+                  </pic:nvPicPr>
+                  <pic:blipFill>
+                    <a:blip r:embed="rId10"/>
+                    <a:stretch>
+                      <a:fillRect/>
+                    </a:stretch>
+                  </pic:blipFill>
+                  <pic:spPr>
+                    <a:xfrm>
+                      <a:off x="0" y="0"/>
+                      <a:ext cx="3162300" cy="1715770"/>
+                    </a:xfrm>
+                    <a:prstGeom prst="rect">
+                      <a:avLst/>
+                    </a:prstGeom>
+                    <a:noFill/>
+                    <a:ln>
+                      <a:noFill/>
+                    </a:ln>
+                  </pic:spPr>
+                </pic:pic>
+              </a:graphicData>
+            </a:graphic>
+          </wp:inline>
+        </w:drawing>
+      </w:r>
+    </w:p>
+    <w:p>
+      <w:pPr>
+        <w:keepNext w:val="0"/>
+        <w:keepLines w:val="0"/>
+        <w:widowControl/>
+        <w:numPr>
+          <w:ilvl w:val="2"/>
+          <w:numId w:val="11"/>
+        </w:numPr>
+        <w:suppressLineNumbers w:val="0"/>
+        <w:spacing w:before="0" w:beforeAutospacing="0" w:after="0" w:afterAutospacing="0" w:line="360" w:lineRule="auto"/>
+        <w:ind w:left="1260" w:leftChars="0" w:right="0" w:hanging="420" w:firstLineChars="0"/>
+        <w:jc w:val="left"/>
+        <w:rPr>
+          <w:rFonts w:hint="default" w:ascii="Bodoni MT" w:hAnsi="Bodoni MT" w:eastAsia="等线" w:cs="Bodoni MT"/>
+          <w:sz w:val="22"/>
+          <w:szCs w:val="22"/>
+        </w:rPr>
+      </w:pPr>
+      <w:r>
+        <w:rPr>
+          <w:rFonts w:hint="default" w:ascii="Bodoni MT" w:hAnsi="Bodoni MT" w:eastAsia="等线" w:cs="Bodoni MT"/>
+          <w:sz w:val="22"/>
+          <w:szCs w:val="22"/>
+          <w:lang w:val="en-US"/>
+        </w:rPr>
+        <w:t xml:space="preserve">PVC: </w:t>
+      </w:r>
+      <w:r>
+        <w:rPr>
+          <w:rFonts w:hint="default" w:ascii="Bodoni MT" w:hAnsi="Bodoni MT" w:eastAsia="等线"/>
+          <w:sz w:val="22"/>
+          <w:szCs w:val="22"/>
+          <w:lang w:val="en-US"/>
+        </w:rPr>
+        <w:t>PersistentVolumeClaim</w:t>
+      </w:r>
+    </w:p>
+    <w:p>
+      <w:pPr>
+        <w:keepNext w:val="0"/>
+        <w:keepLines w:val="0"/>
+        <w:widowControl/>
+        <w:numPr>
+          <w:ilvl w:val="1"/>
+          <w:numId w:val="11"/>
+        </w:numPr>
+        <w:suppressLineNumbers w:val="0"/>
+        <w:spacing w:before="0" w:beforeAutospacing="0" w:after="0" w:afterAutospacing="0" w:line="360" w:lineRule="auto"/>
+        <w:ind w:left="840" w:leftChars="0" w:right="0" w:hanging="420" w:firstLineChars="0"/>
+        <w:jc w:val="left"/>
+        <w:rPr>
+          <w:rFonts w:hint="default" w:ascii="Bodoni MT" w:hAnsi="Bodoni MT" w:eastAsia="等线" w:cs="Bodoni MT"/>
+          <w:sz w:val="22"/>
+          <w:szCs w:val="22"/>
+        </w:rPr>
+      </w:pPr>
+      <w:r>
+        <w:rPr>
+          <w:rFonts w:hint="default" w:ascii="Bodoni MT" w:hAnsi="Bodoni MT" w:eastAsia="等线"/>
+          <w:sz w:val="22"/>
+          <w:szCs w:val="22"/>
+          <w:lang w:val="en-US"/>
+        </w:rPr>
+        <w:t>In simple terms,</w:t>
+      </w:r>
+      <w:r>
+        <w:rPr>
+          <w:rFonts w:hint="default" w:ascii="Bodoni MT" w:hAnsi="Bodoni MT" w:eastAsia="等线"/>
+          <w:color w:val="C00000"/>
+          <w:sz w:val="22"/>
+          <w:szCs w:val="22"/>
+          <w:shd w:val="clear" w:color="FFFFFF" w:fill="D9D9D9"/>
+          <w:lang w:val="en-US"/>
+        </w:rPr>
+        <w:t xml:space="preserve"> CSI is the interface that allows Kubernetes to interact with external storage systems to create, attach, and mount volumes for Pods</w:t>
+      </w:r>
+      <w:r>
+        <w:rPr>
+          <w:rFonts w:hint="default" w:ascii="Bodoni MT" w:hAnsi="Bodoni MT" w:eastAsia="等线"/>
+          <w:sz w:val="22"/>
+          <w:szCs w:val="22"/>
+          <w:lang w:val="en-US"/>
+        </w:rPr>
+        <w:t>.</w:t>
       </w:r>
     </w:p>
     <w:p>
@@ -9055,6 +10121,63 @@
     </w:p>
     <w:p>
       <w:pPr>
+        <w:rPr>
+          <w:rFonts w:hint="default" w:ascii="Bodoni MT" w:hAnsi="Bodoni MT" w:eastAsia="等线" w:cs="Bodoni MT"/>
+          <w:sz w:val="22"/>
+          <w:szCs w:val="22"/>
+        </w:rPr>
+      </w:pPr>
+      <w:r>
+        <w:rPr>
+          <w:rFonts w:hint="default" w:ascii="Bodoni MT" w:hAnsi="Bodoni MT" w:eastAsia="等线" w:cs="Bodoni MT"/>
+          <w:sz w:val="22"/>
+          <w:szCs w:val="22"/>
+          <w:lang w:val="en-IN"/>
+        </w:rPr>
+        <w:br w:type="page"/>
+      </w:r>
+    </w:p>
+    <w:p>
+      <w:pPr>
+        <w:keepNext w:val="0"/>
+        <w:keepLines w:val="0"/>
+        <w:widowControl/>
+        <w:numPr>
+          <w:numId w:val="0"/>
+        </w:numPr>
+        <w:suppressLineNumbers w:val="0"/>
+        <w:spacing w:before="0" w:beforeAutospacing="0" w:after="0" w:afterAutospacing="0" w:line="360" w:lineRule="auto"/>
+        <w:ind w:leftChars="0" w:right="0" w:rightChars="0"/>
+        <w:jc w:val="center"/>
+        <w:rPr>
+          <w:rFonts w:hint="default" w:ascii="Bodoni MT" w:hAnsi="Bodoni MT" w:eastAsia="等线" w:cs="Bodoni MT"/>
+          <w:b/>
+          <w:bCs/>
+          <w:color w:val="002060"/>
+          <w:sz w:val="28"/>
+          <w:szCs w:val="28"/>
+          <w:highlight w:val="lightGray"/>
+          <w:u w:val="single"/>
+          <w:lang w:val="en-US"/>
+        </w:rPr>
+      </w:pPr>
+      <w:r>
+        <w:rPr>
+          <w:rFonts w:hint="default" w:ascii="Bodoni MT" w:hAnsi="Bodoni MT" w:eastAsia="等线" w:cs="Bodoni MT"/>
+          <w:b/>
+          <w:bCs/>
+          <w:color w:val="002060"/>
+          <w:sz w:val="28"/>
+          <w:szCs w:val="28"/>
+          <w:highlight w:val="lightGray"/>
+          <w:u w:val="single"/>
+          <w:lang w:val="en-US"/>
+        </w:rPr>
+        <w:t xml:space="preserve">  Installing and Setup (KinD, Civo, GKE)  </w:t>
+      </w:r>
+    </w:p>
+    <w:p>
+      <w:pPr>
         <w:keepNext w:val="0"/>
         <w:keepLines w:val="0"/>
         <w:widowControl/>
@@ -9075,14 +10198,749 @@
       <w:r>
         <w:rPr>
           <w:rFonts w:hint="default" w:ascii="Bodoni MT" w:hAnsi="Bodoni MT" w:eastAsia="等线" w:cs="Bodoni MT"/>
-          <w:color w:val="auto"/>
-          <w:kern w:val="0"/>
-          <w:sz w:val="22"/>
-          <w:szCs w:val="22"/>
-          <w:lang w:val="en-IN" w:eastAsia="zh-CN" w:bidi="ar"/>
-        </w:rPr>
-        <w:t>F</w:t>
-      </w:r>
+          <w:b/>
+          <w:bCs/>
+          <w:sz w:val="22"/>
+          <w:szCs w:val="22"/>
+          <w:lang w:val="en-IN"/>
+        </w:rPr>
+        <w:t>KinD</w:t>
+      </w:r>
+    </w:p>
+    <w:p>
+      <w:pPr>
+        <w:keepNext w:val="0"/>
+        <w:keepLines w:val="0"/>
+        <w:widowControl/>
+        <w:numPr>
+          <w:ilvl w:val="1"/>
+          <w:numId w:val="11"/>
+        </w:numPr>
+        <w:suppressLineNumbers w:val="0"/>
+        <w:spacing w:before="0" w:beforeAutospacing="0" w:after="0" w:afterAutospacing="0" w:line="360" w:lineRule="auto"/>
+        <w:ind w:left="840" w:leftChars="0" w:right="0" w:hanging="420" w:firstLineChars="0"/>
+        <w:jc w:val="left"/>
+        <w:rPr>
+          <w:rFonts w:hint="default" w:ascii="Bodoni MT" w:hAnsi="Bodoni MT" w:eastAsia="等线" w:cs="Bodoni MT"/>
+          <w:sz w:val="22"/>
+          <w:szCs w:val="22"/>
+        </w:rPr>
+      </w:pPr>
+      <w:r>
+        <w:rPr>
+          <w:rFonts w:hint="default" w:ascii="Bodoni MT" w:hAnsi="Bodoni MT" w:eastAsia="等线" w:cs="Bodoni MT"/>
+          <w:b w:val="0"/>
+          <w:bCs w:val="0"/>
+          <w:sz w:val="22"/>
+          <w:szCs w:val="22"/>
+          <w:lang w:val="en-IN"/>
+        </w:rPr>
+        <w:t>It is used to run the Kubernetes cluster inside Docker container without involving any cloud.</w:t>
+      </w:r>
+      <w:r>
+        <w:rPr>
+          <w:rFonts w:hint="default" w:ascii="Bodoni MT" w:hAnsi="Bodoni MT" w:eastAsia="等线" w:cs="Bodoni MT"/>
+          <w:b w:val="0"/>
+          <w:bCs w:val="0"/>
+          <w:sz w:val="22"/>
+          <w:szCs w:val="22"/>
+          <w:lang w:val="en-IN"/>
+        </w:rPr>
+        <w:br w:type="textWrapping"/>
+      </w:r>
+      <w:r>
+        <w:rPr>
+          <w:rFonts w:hint="default" w:ascii="Bodoni MT" w:hAnsi="Bodoni MT" w:eastAsia="等线" w:cs="Bodoni MT"/>
+          <w:b w:val="0"/>
+          <w:bCs w:val="0"/>
+          <w:sz w:val="22"/>
+          <w:szCs w:val="22"/>
+          <w:lang w:val="en-IN"/>
+        </w:rPr>
+        <w:t>It is just used for learning, testing, CI pipelines.</w:t>
+      </w:r>
+    </w:p>
+    <w:p>
+      <w:pPr>
+        <w:keepNext w:val="0"/>
+        <w:keepLines w:val="0"/>
+        <w:widowControl/>
+        <w:numPr>
+          <w:ilvl w:val="1"/>
+          <w:numId w:val="11"/>
+        </w:numPr>
+        <w:suppressLineNumbers w:val="0"/>
+        <w:spacing w:before="0" w:beforeAutospacing="0" w:after="0" w:afterAutospacing="0" w:line="360" w:lineRule="auto"/>
+        <w:ind w:left="840" w:leftChars="0" w:right="0" w:hanging="420" w:firstLineChars="0"/>
+        <w:jc w:val="left"/>
+        <w:rPr>
+          <w:rFonts w:hint="default" w:ascii="Bodoni MT" w:hAnsi="Bodoni MT" w:eastAsia="等线" w:cs="Bodoni MT"/>
+          <w:sz w:val="22"/>
+          <w:szCs w:val="22"/>
+        </w:rPr>
+      </w:pPr>
+      <w:r>
+        <w:rPr>
+          <w:rFonts w:hint="default" w:ascii="Bodoni MT" w:hAnsi="Bodoni MT" w:eastAsia="等线" w:cs="Bodoni MT"/>
+          <w:sz w:val="22"/>
+          <w:szCs w:val="22"/>
+          <w:lang w:val="en-IN"/>
+        </w:rPr>
+        <w:t>You can create as many containers as you want. All containers will be treated as a Node.</w:t>
+      </w:r>
+      <w:r>
+        <w:rPr>
+          <w:rFonts w:hint="default" w:ascii="Bodoni MT" w:hAnsi="Bodoni MT" w:eastAsia="等线" w:cs="Bodoni MT"/>
+          <w:sz w:val="22"/>
+          <w:szCs w:val="22"/>
+          <w:lang w:val="en-IN"/>
+        </w:rPr>
+        <w:br w:type="textWrapping"/>
+      </w:r>
+      <w:r>
+        <w:drawing>
+          <wp:inline distT="0" distB="0" distL="114300" distR="114300">
+            <wp:extent cx="1831340" cy="775335"/>
+            <wp:effectExtent l="0" t="0" r="10160" b="12065"/>
+            <wp:docPr id="11" name="Picture 6"/>
+            <wp:cNvGraphicFramePr>
+              <a:graphicFrameLocks xmlns:a="http://schemas.openxmlformats.org/drawingml/2006/main" noChangeAspect="1"/>
+            </wp:cNvGraphicFramePr>
+            <a:graphic xmlns:a="http://schemas.openxmlformats.org/drawingml/2006/main">
+              <a:graphicData uri="http://schemas.openxmlformats.org/drawingml/2006/picture">
+                <pic:pic xmlns:pic="http://schemas.openxmlformats.org/drawingml/2006/picture">
+                  <pic:nvPicPr>
+                    <pic:cNvPr id="11" name="Picture 6"/>
+                    <pic:cNvPicPr>
+                      <a:picLocks noChangeAspect="1"/>
+                    </pic:cNvPicPr>
+                  </pic:nvPicPr>
+                  <pic:blipFill>
+                    <a:blip r:embed="rId11"/>
+                    <a:stretch>
+                      <a:fillRect/>
+                    </a:stretch>
+                  </pic:blipFill>
+                  <pic:spPr>
+                    <a:xfrm>
+                      <a:off x="0" y="0"/>
+                      <a:ext cx="1831340" cy="775335"/>
+                    </a:xfrm>
+                    <a:prstGeom prst="rect">
+                      <a:avLst/>
+                    </a:prstGeom>
+                    <a:noFill/>
+                    <a:ln>
+                      <a:noFill/>
+                    </a:ln>
+                  </pic:spPr>
+                </pic:pic>
+              </a:graphicData>
+            </a:graphic>
+          </wp:inline>
+        </w:drawing>
+      </w:r>
+    </w:p>
+    <w:p>
+      <w:pPr>
+        <w:keepNext w:val="0"/>
+        <w:keepLines w:val="0"/>
+        <w:widowControl/>
+        <w:numPr>
+          <w:ilvl w:val="1"/>
+          <w:numId w:val="11"/>
+        </w:numPr>
+        <w:suppressLineNumbers w:val="0"/>
+        <w:spacing w:before="0" w:beforeAutospacing="0" w:after="0" w:afterAutospacing="0" w:line="360" w:lineRule="auto"/>
+        <w:ind w:left="840" w:leftChars="0" w:right="0" w:hanging="420" w:firstLineChars="0"/>
+        <w:jc w:val="left"/>
+        <w:rPr>
+          <w:rFonts w:hint="default" w:ascii="Bodoni MT" w:hAnsi="Bodoni MT" w:eastAsia="等线" w:cs="Bodoni MT"/>
+          <w:sz w:val="22"/>
+          <w:szCs w:val="22"/>
+        </w:rPr>
+      </w:pPr>
+      <w:r>
+        <w:rPr>
+          <w:rFonts w:hint="default" w:ascii="Bodoni MT" w:hAnsi="Bodoni MT" w:eastAsia="等线" w:cs="Bodoni MT"/>
+          <w:sz w:val="22"/>
+          <w:szCs w:val="22"/>
+          <w:lang w:val="en-IN"/>
+        </w:rPr>
+        <w:t>Lets say you creates only one container, and install all the services of both control plane and data plane inside that.</w:t>
+      </w:r>
+      <w:r>
+        <w:rPr>
+          <w:rFonts w:hint="default" w:ascii="Bodoni MT" w:hAnsi="Bodoni MT" w:eastAsia="等线" w:cs="Bodoni MT"/>
+          <w:sz w:val="22"/>
+          <w:szCs w:val="22"/>
+          <w:lang w:val="en-IN"/>
+        </w:rPr>
+        <w:br w:type="textWrapping"/>
+      </w:r>
+      <w:r>
+        <w:rPr>
+          <w:rFonts w:hint="default" w:ascii="Bodoni MT" w:hAnsi="Bodoni MT" w:eastAsia="等线" w:cs="Bodoni MT"/>
+          <w:sz w:val="22"/>
+          <w:szCs w:val="22"/>
+          <w:lang w:val="en-IN"/>
+        </w:rPr>
+        <w:tab/>
+        <w:t xml:space="preserve">Then just like the single node setup, the </w:t>
+      </w:r>
+      <w:r>
+        <w:rPr>
+          <w:rFonts w:hint="default" w:ascii="Bodoni MT" w:hAnsi="Bodoni MT" w:eastAsia="等线" w:cs="Bodoni MT"/>
+          <w:b/>
+          <w:bCs/>
+          <w:sz w:val="22"/>
+          <w:szCs w:val="22"/>
+          <w:lang w:val="en-IN"/>
+        </w:rPr>
+        <w:t>sched</w:t>
+      </w:r>
+      <w:r>
+        <w:rPr>
+          <w:rFonts w:hint="default" w:ascii="Bodoni MT" w:hAnsi="Bodoni MT" w:eastAsia="等线" w:cs="Bodoni MT"/>
+          <w:b w:val="0"/>
+          <w:bCs w:val="0"/>
+          <w:sz w:val="22"/>
+          <w:szCs w:val="22"/>
+          <w:lang w:val="en-IN"/>
+        </w:rPr>
+        <w:t xml:space="preserve"> will assign all the pods to the same node (the container that is running all services).</w:t>
+      </w:r>
+    </w:p>
+    <w:p>
+      <w:pPr>
+        <w:keepNext w:val="0"/>
+        <w:keepLines w:val="0"/>
+        <w:widowControl/>
+        <w:numPr>
+          <w:ilvl w:val="1"/>
+          <w:numId w:val="11"/>
+        </w:numPr>
+        <w:suppressLineNumbers w:val="0"/>
+        <w:spacing w:before="0" w:beforeAutospacing="0" w:after="0" w:afterAutospacing="0" w:line="360" w:lineRule="auto"/>
+        <w:ind w:left="840" w:leftChars="0" w:right="0" w:hanging="420" w:firstLineChars="0"/>
+        <w:jc w:val="left"/>
+        <w:rPr>
+          <w:rFonts w:hint="default" w:ascii="Bodoni MT" w:hAnsi="Bodoni MT" w:eastAsia="等线" w:cs="Bodoni MT"/>
+          <w:sz w:val="22"/>
+          <w:szCs w:val="22"/>
+        </w:rPr>
+      </w:pPr>
+      <w:r>
+        <w:rPr>
+          <w:rFonts w:hint="default" w:ascii="Bodoni MT" w:hAnsi="Bodoni MT" w:eastAsia="等线" w:cs="Bodoni MT"/>
+          <w:b w:val="0"/>
+          <w:bCs w:val="0"/>
+          <w:sz w:val="22"/>
+          <w:szCs w:val="22"/>
+          <w:lang w:val="en-IN"/>
+        </w:rPr>
+        <w:t xml:space="preserve">Basically the container runs </w:t>
+      </w:r>
+      <w:r>
+        <w:rPr>
+          <w:rFonts w:hint="default" w:ascii="Bodoni MT" w:hAnsi="Bodoni MT" w:eastAsia="等线" w:cs="Bodoni MT"/>
+          <w:b w:val="0"/>
+          <w:bCs w:val="0"/>
+          <w:i/>
+          <w:iCs/>
+          <w:sz w:val="22"/>
+          <w:szCs w:val="22"/>
+          <w:lang w:val="en-IN"/>
+        </w:rPr>
+        <w:t xml:space="preserve">Kubelet, containerd </w:t>
+      </w:r>
+      <w:r>
+        <w:rPr>
+          <w:rFonts w:hint="default" w:ascii="Bodoni MT" w:hAnsi="Bodoni MT" w:eastAsia="等线" w:cs="Bodoni MT"/>
+          <w:b w:val="0"/>
+          <w:bCs w:val="0"/>
+          <w:i w:val="0"/>
+          <w:iCs w:val="0"/>
+          <w:sz w:val="22"/>
+          <w:szCs w:val="22"/>
+          <w:lang w:val="en-IN"/>
+        </w:rPr>
+        <w:t>(container runtime)</w:t>
+      </w:r>
+      <w:r>
+        <w:rPr>
+          <w:rFonts w:hint="default" w:ascii="Bodoni MT" w:hAnsi="Bodoni MT" w:eastAsia="等线" w:cs="Bodoni MT"/>
+          <w:b w:val="0"/>
+          <w:bCs w:val="0"/>
+          <w:i/>
+          <w:iCs/>
+          <w:sz w:val="22"/>
+          <w:szCs w:val="22"/>
+          <w:lang w:val="en-IN"/>
+        </w:rPr>
+        <w:t xml:space="preserve">, </w:t>
+      </w:r>
+      <w:r>
+        <w:rPr>
+          <w:rFonts w:hint="default" w:ascii="Bodoni MT" w:hAnsi="Bodoni MT" w:eastAsia="等线" w:cs="Bodoni MT"/>
+          <w:b w:val="0"/>
+          <w:bCs w:val="0"/>
+          <w:i w:val="0"/>
+          <w:iCs w:val="0"/>
+          <w:sz w:val="22"/>
+          <w:szCs w:val="22"/>
+          <w:lang w:val="en-IN"/>
+        </w:rPr>
+        <w:t xml:space="preserve">kube-proxy, and </w:t>
+      </w:r>
+      <w:r>
+        <w:rPr>
+          <w:rFonts w:hint="default" w:ascii="Bodoni MT" w:hAnsi="Bodoni MT" w:eastAsia="等线" w:cs="Bodoni MT"/>
+          <w:b w:val="0"/>
+          <w:bCs w:val="0"/>
+          <w:i/>
+          <w:iCs/>
+          <w:sz w:val="22"/>
+          <w:szCs w:val="22"/>
+          <w:lang w:val="en-IN"/>
+        </w:rPr>
+        <w:t xml:space="preserve">control plane components </w:t>
+      </w:r>
+      <w:r>
+        <w:rPr>
+          <w:rFonts w:hint="default" w:ascii="Bodoni MT" w:hAnsi="Bodoni MT" w:eastAsia="等线" w:cs="Bodoni MT"/>
+          <w:b w:val="0"/>
+          <w:bCs w:val="0"/>
+          <w:i w:val="0"/>
+          <w:iCs w:val="0"/>
+          <w:sz w:val="22"/>
+          <w:szCs w:val="22"/>
+          <w:lang w:val="en-IN"/>
+        </w:rPr>
+        <w:t>(if it’s a control plane node).</w:t>
+      </w:r>
+    </w:p>
+    <w:p>
+      <w:pPr>
+        <w:keepNext w:val="0"/>
+        <w:keepLines w:val="0"/>
+        <w:widowControl/>
+        <w:numPr>
+          <w:ilvl w:val="1"/>
+          <w:numId w:val="11"/>
+        </w:numPr>
+        <w:suppressLineNumbers w:val="0"/>
+        <w:spacing w:before="0" w:beforeAutospacing="0" w:after="0" w:afterAutospacing="0" w:line="360" w:lineRule="auto"/>
+        <w:ind w:left="840" w:leftChars="0" w:right="0" w:hanging="420" w:firstLineChars="0"/>
+        <w:jc w:val="left"/>
+        <w:rPr>
+          <w:rFonts w:hint="default" w:ascii="Bodoni MT" w:hAnsi="Bodoni MT" w:eastAsia="等线" w:cs="Bodoni MT"/>
+          <w:sz w:val="22"/>
+          <w:szCs w:val="22"/>
+        </w:rPr>
+      </w:pPr>
+      <w:r>
+        <w:drawing>
+          <wp:inline distT="0" distB="0" distL="114300" distR="114300">
+            <wp:extent cx="2409825" cy="1527175"/>
+            <wp:effectExtent l="0" t="0" r="3175" b="9525"/>
+            <wp:docPr id="10" name="Picture 5"/>
+            <wp:cNvGraphicFramePr>
+              <a:graphicFrameLocks xmlns:a="http://schemas.openxmlformats.org/drawingml/2006/main" noChangeAspect="1"/>
+            </wp:cNvGraphicFramePr>
+            <a:graphic xmlns:a="http://schemas.openxmlformats.org/drawingml/2006/main">
+              <a:graphicData uri="http://schemas.openxmlformats.org/drawingml/2006/picture">
+                <pic:pic xmlns:pic="http://schemas.openxmlformats.org/drawingml/2006/picture">
+                  <pic:nvPicPr>
+                    <pic:cNvPr id="10" name="Picture 5"/>
+                    <pic:cNvPicPr>
+                      <a:picLocks noChangeAspect="1"/>
+                    </pic:cNvPicPr>
+                  </pic:nvPicPr>
+                  <pic:blipFill>
+                    <a:blip r:embed="rId12"/>
+                    <a:stretch>
+                      <a:fillRect/>
+                    </a:stretch>
+                  </pic:blipFill>
+                  <pic:spPr>
+                    <a:xfrm>
+                      <a:off x="0" y="0"/>
+                      <a:ext cx="2409825" cy="1527175"/>
+                    </a:xfrm>
+                    <a:prstGeom prst="rect">
+                      <a:avLst/>
+                    </a:prstGeom>
+                    <a:noFill/>
+                    <a:ln>
+                      <a:noFill/>
+                    </a:ln>
+                  </pic:spPr>
+                </pic:pic>
+              </a:graphicData>
+            </a:graphic>
+          </wp:inline>
+        </w:drawing>
+      </w:r>
+    </w:p>
+    <w:p>
+      <w:pPr>
+        <w:keepNext w:val="0"/>
+        <w:keepLines w:val="0"/>
+        <w:widowControl/>
+        <w:numPr>
+          <w:ilvl w:val="1"/>
+          <w:numId w:val="11"/>
+        </w:numPr>
+        <w:suppressLineNumbers w:val="0"/>
+        <w:spacing w:before="0" w:beforeAutospacing="0" w:after="0" w:afterAutospacing="0" w:line="360" w:lineRule="auto"/>
+        <w:ind w:left="840" w:leftChars="0" w:right="0" w:hanging="420" w:firstLineChars="0"/>
+        <w:jc w:val="left"/>
+        <w:rPr>
+          <w:rFonts w:hint="default" w:ascii="Bodoni MT" w:hAnsi="Bodoni MT" w:eastAsia="等线" w:cs="Bodoni MT"/>
+          <w:sz w:val="22"/>
+          <w:szCs w:val="22"/>
+        </w:rPr>
+      </w:pPr>
+      <w:r>
+        <w:rPr>
+          <w:rFonts w:hint="default" w:ascii="Bodoni MT" w:hAnsi="Bodoni MT" w:eastAsia="等线" w:cs="Bodoni MT"/>
+          <w:sz w:val="22"/>
+          <w:szCs w:val="22"/>
+          <w:lang w:val="en-IN"/>
+        </w:rPr>
+        <w:t xml:space="preserve">In simple words: </w:t>
+      </w:r>
+      <w:r>
+        <w:rPr>
+          <w:rFonts w:hint="default" w:ascii="Bodoni MT" w:hAnsi="Bodoni MT" w:eastAsia="等线" w:cs="Bodoni MT"/>
+          <w:b/>
+          <w:bCs/>
+          <w:sz w:val="22"/>
+          <w:szCs w:val="22"/>
+          <w:lang w:val="en-IN"/>
+        </w:rPr>
+        <w:t>KinD</w:t>
+      </w:r>
+      <w:r>
+        <w:rPr>
+          <w:rFonts w:hint="default" w:ascii="Bodoni MT" w:hAnsi="Bodoni MT" w:eastAsia="等线" w:cs="Bodoni MT"/>
+          <w:b w:val="0"/>
+          <w:bCs w:val="0"/>
+          <w:sz w:val="22"/>
+          <w:szCs w:val="22"/>
+          <w:lang w:val="en-IN"/>
+        </w:rPr>
+        <w:t xml:space="preserve"> uses Docker containers as </w:t>
+      </w:r>
+      <w:r>
+        <w:rPr>
+          <w:rFonts w:hint="default" w:ascii="Bodoni MT" w:hAnsi="Bodoni MT" w:eastAsia="等线" w:cs="Bodoni MT"/>
+          <w:b w:val="0"/>
+          <w:bCs w:val="0"/>
+          <w:i/>
+          <w:iCs/>
+          <w:sz w:val="22"/>
+          <w:szCs w:val="22"/>
+          <w:lang w:val="en-IN"/>
+        </w:rPr>
+        <w:t>fake VMs</w:t>
+      </w:r>
+      <w:r>
+        <w:rPr>
+          <w:rFonts w:hint="default" w:ascii="Bodoni MT" w:hAnsi="Bodoni MT" w:eastAsia="等线" w:cs="Bodoni MT"/>
+          <w:b w:val="0"/>
+          <w:bCs w:val="0"/>
+          <w:i w:val="0"/>
+          <w:iCs w:val="0"/>
+          <w:sz w:val="22"/>
+          <w:szCs w:val="22"/>
+          <w:lang w:val="en-IN"/>
+        </w:rPr>
+        <w:t xml:space="preserve"> to simulate Nodes.</w:t>
+      </w:r>
+    </w:p>
+    <w:p>
+      <w:pPr>
+        <w:keepNext w:val="0"/>
+        <w:keepLines w:val="0"/>
+        <w:widowControl/>
+        <w:numPr>
+          <w:ilvl w:val="1"/>
+          <w:numId w:val="11"/>
+        </w:numPr>
+        <w:suppressLineNumbers w:val="0"/>
+        <w:spacing w:before="0" w:beforeAutospacing="0" w:after="0" w:afterAutospacing="0" w:line="360" w:lineRule="auto"/>
+        <w:ind w:left="840" w:leftChars="0" w:right="0" w:hanging="420" w:firstLineChars="0"/>
+        <w:jc w:val="left"/>
+        <w:rPr>
+          <w:rFonts w:hint="default" w:ascii="Bodoni MT" w:hAnsi="Bodoni MT" w:eastAsia="等线" w:cs="Bodoni MT"/>
+          <w:sz w:val="22"/>
+          <w:szCs w:val="22"/>
+        </w:rPr>
+      </w:pPr>
+      <w:r>
+        <w:rPr>
+          <w:rFonts w:hint="default" w:ascii="Bodoni MT" w:hAnsi="Bodoni MT" w:eastAsia="等线"/>
+          <w:color w:val="C00000"/>
+          <w:sz w:val="22"/>
+          <w:szCs w:val="22"/>
+        </w:rPr>
+        <w:t>Every Kubernetes cluster MUST have control plane</w:t>
+      </w:r>
+      <w:r>
+        <w:rPr>
+          <w:rFonts w:hint="default" w:ascii="Bodoni MT" w:hAnsi="Bodoni MT" w:eastAsia="等线"/>
+          <w:sz w:val="22"/>
+          <w:szCs w:val="22"/>
+          <w:lang w:val="en-IN"/>
+        </w:rPr>
+        <w:t xml:space="preserve">. </w:t>
+      </w:r>
+      <w:r>
+        <w:rPr>
+          <w:rFonts w:hint="default" w:ascii="Bodoni MT" w:hAnsi="Bodoni MT" w:eastAsia="等线"/>
+          <w:sz w:val="22"/>
+          <w:szCs w:val="22"/>
+          <w:lang w:val="en-IN"/>
+        </w:rPr>
+        <w:br w:type="textWrapping"/>
+      </w:r>
+      <w:r>
+        <w:rPr>
+          <w:rFonts w:hint="default" w:ascii="Bodoni MT" w:hAnsi="Bodoni MT" w:eastAsia="等线"/>
+          <w:color w:val="C00000"/>
+          <w:sz w:val="22"/>
+          <w:szCs w:val="22"/>
+          <w:lang w:val="en-IN"/>
+        </w:rPr>
+        <w:t xml:space="preserve">At least one KinD container </w:t>
+      </w:r>
+      <w:r>
+        <w:rPr>
+          <w:rFonts w:hint="default" w:ascii="Bodoni MT" w:hAnsi="Bodoni MT" w:eastAsia="等线"/>
+          <w:b/>
+          <w:bCs/>
+          <w:color w:val="C00000"/>
+          <w:sz w:val="22"/>
+          <w:szCs w:val="22"/>
+          <w:lang w:val="en-IN"/>
+        </w:rPr>
+        <w:t>must be a control-plane</w:t>
+      </w:r>
+      <w:r>
+        <w:rPr>
+          <w:rFonts w:hint="default" w:ascii="Bodoni MT" w:hAnsi="Bodoni MT" w:eastAsia="等线"/>
+          <w:color w:val="C00000"/>
+          <w:sz w:val="22"/>
+          <w:szCs w:val="22"/>
+          <w:lang w:val="en-IN"/>
+        </w:rPr>
+        <w:t xml:space="preserve"> node. Worker (data plane) containers are </w:t>
+      </w:r>
+      <w:r>
+        <w:rPr>
+          <w:rFonts w:hint="default" w:ascii="Bodoni MT" w:hAnsi="Bodoni MT" w:eastAsia="等线"/>
+          <w:b/>
+          <w:bCs/>
+          <w:color w:val="C00000"/>
+          <w:sz w:val="22"/>
+          <w:szCs w:val="22"/>
+          <w:lang w:val="en-IN"/>
+        </w:rPr>
+        <w:t>optional</w:t>
+      </w:r>
+    </w:p>
+    <w:p>
+      <w:pPr>
+        <w:keepNext w:val="0"/>
+        <w:keepLines w:val="0"/>
+        <w:widowControl/>
+        <w:numPr>
+          <w:ilvl w:val="1"/>
+          <w:numId w:val="11"/>
+        </w:numPr>
+        <w:suppressLineNumbers w:val="0"/>
+        <w:spacing w:before="0" w:beforeAutospacing="0" w:after="0" w:afterAutospacing="0" w:line="360" w:lineRule="auto"/>
+        <w:ind w:left="840" w:leftChars="0" w:right="0" w:hanging="420" w:firstLineChars="0"/>
+        <w:jc w:val="left"/>
+        <w:rPr>
+          <w:rFonts w:hint="default" w:ascii="Bodoni MT" w:hAnsi="Bodoni MT" w:eastAsia="等线" w:cs="Bodoni MT"/>
+          <w:sz w:val="22"/>
+          <w:szCs w:val="22"/>
+        </w:rPr>
+      </w:pPr>
+      <w:r>
+        <w:rPr>
+          <w:rFonts w:hint="default" w:ascii="Bodoni MT" w:hAnsi="Bodoni MT" w:eastAsia="等线" w:cs="Bodoni MT"/>
+          <w:sz w:val="22"/>
+          <w:szCs w:val="22"/>
+          <w:lang w:val="en-IN"/>
+        </w:rPr>
+        <w:t>It looks like container inside container (when pods runs the container within it, but the pod is there inside KinD container)</w:t>
+      </w:r>
+    </w:p>
+    <w:p>
+      <w:pPr>
+        <w:keepNext w:val="0"/>
+        <w:keepLines w:val="0"/>
+        <w:widowControl/>
+        <w:numPr>
+          <w:ilvl w:val="2"/>
+          <w:numId w:val="11"/>
+        </w:numPr>
+        <w:suppressLineNumbers w:val="0"/>
+        <w:spacing w:before="0" w:beforeAutospacing="0" w:after="0" w:afterAutospacing="0" w:line="360" w:lineRule="auto"/>
+        <w:ind w:left="1260" w:leftChars="0" w:right="0" w:hanging="420" w:firstLineChars="0"/>
+        <w:jc w:val="left"/>
+        <w:rPr>
+          <w:rFonts w:hint="default" w:ascii="Bodoni MT" w:hAnsi="Bodoni MT" w:eastAsia="等线" w:cs="Bodoni MT"/>
+          <w:sz w:val="22"/>
+          <w:szCs w:val="22"/>
+        </w:rPr>
+      </w:pPr>
+      <w:r>
+        <w:rPr>
+          <w:rFonts w:hint="default" w:ascii="Bodoni MT" w:hAnsi="Bodoni MT" w:eastAsia="等线" w:cs="Bodoni MT"/>
+          <w:sz w:val="22"/>
+          <w:szCs w:val="22"/>
+          <w:lang w:val="en-IN"/>
+        </w:rPr>
+        <w:t xml:space="preserve">Containers are nothing but a namespace and cgroups. </w:t>
+      </w:r>
+      <w:r>
+        <w:rPr>
+          <w:rFonts w:hint="default" w:ascii="Bodoni MT" w:hAnsi="Bodoni MT" w:eastAsia="等线" w:cs="Bodoni MT"/>
+          <w:sz w:val="22"/>
+          <w:szCs w:val="22"/>
+          <w:lang w:val="en-IN"/>
+        </w:rPr>
+        <w:br w:type="textWrapping"/>
+      </w:r>
+      <w:r>
+        <w:rPr>
+          <w:rFonts w:hint="default" w:ascii="Bodoni MT" w:hAnsi="Bodoni MT" w:eastAsia="等线" w:cs="Bodoni MT"/>
+          <w:sz w:val="22"/>
+          <w:szCs w:val="22"/>
+          <w:lang w:val="en-IN"/>
+        </w:rPr>
+        <w:t>At kernel level, it is just a process.</w:t>
+      </w:r>
+    </w:p>
+    <w:p>
+      <w:pPr>
+        <w:keepNext w:val="0"/>
+        <w:keepLines w:val="0"/>
+        <w:widowControl/>
+        <w:numPr>
+          <w:ilvl w:val="2"/>
+          <w:numId w:val="11"/>
+        </w:numPr>
+        <w:suppressLineNumbers w:val="0"/>
+        <w:spacing w:before="0" w:beforeAutospacing="0" w:after="0" w:afterAutospacing="0" w:line="360" w:lineRule="auto"/>
+        <w:ind w:left="1260" w:leftChars="0" w:right="0" w:hanging="420" w:firstLineChars="0"/>
+        <w:jc w:val="left"/>
+        <w:rPr>
+          <w:rFonts w:hint="default" w:ascii="Bodoni MT" w:hAnsi="Bodoni MT" w:eastAsia="等线" w:cs="Bodoni MT"/>
+          <w:sz w:val="22"/>
+          <w:szCs w:val="22"/>
+        </w:rPr>
+      </w:pPr>
+      <w:r>
+        <w:rPr>
+          <w:rFonts w:hint="default" w:ascii="Bodoni MT" w:hAnsi="Bodoni MT" w:eastAsia="等线" w:cs="Bodoni MT"/>
+          <w:sz w:val="22"/>
+          <w:szCs w:val="22"/>
+          <w:lang w:val="en-IN"/>
+        </w:rPr>
+        <w:t>So, when kubelet will call containerd (inside KinD container (node)) it’ll create a new container.</w:t>
+      </w:r>
+      <w:r>
+        <w:rPr>
+          <w:rFonts w:hint="default" w:ascii="Bodoni MT" w:hAnsi="Bodoni MT" w:eastAsia="等线" w:cs="Bodoni MT"/>
+          <w:sz w:val="22"/>
+          <w:szCs w:val="22"/>
+          <w:lang w:val="en-IN"/>
+        </w:rPr>
+        <w:br w:type="textWrapping"/>
+      </w:r>
+      <w:r>
+        <w:rPr>
+          <w:rFonts w:hint="default" w:ascii="Bodoni MT" w:hAnsi="Bodoni MT" w:eastAsia="等线" w:cs="Bodoni MT"/>
+          <w:sz w:val="22"/>
+          <w:szCs w:val="22"/>
+          <w:lang w:val="en-IN"/>
+        </w:rPr>
+        <w:t>It looks nested, but its actually not. The new container will have a new set of namespace and cgroups.</w:t>
+      </w:r>
+    </w:p>
+    <w:p>
+      <w:pPr>
+        <w:keepNext w:val="0"/>
+        <w:keepLines w:val="0"/>
+        <w:widowControl/>
+        <w:numPr>
+          <w:ilvl w:val="2"/>
+          <w:numId w:val="11"/>
+        </w:numPr>
+        <w:suppressLineNumbers w:val="0"/>
+        <w:spacing w:before="0" w:beforeAutospacing="0" w:after="0" w:afterAutospacing="0" w:line="360" w:lineRule="auto"/>
+        <w:ind w:left="1260" w:leftChars="0" w:right="0" w:hanging="420" w:firstLineChars="0"/>
+        <w:jc w:val="left"/>
+        <w:rPr>
+          <w:rFonts w:hint="default" w:ascii="Bodoni MT" w:hAnsi="Bodoni MT" w:eastAsia="等线" w:cs="Bodoni MT"/>
+          <w:sz w:val="22"/>
+          <w:szCs w:val="22"/>
+        </w:rPr>
+      </w:pPr>
+      <w:r>
+        <w:rPr>
+          <w:rFonts w:hint="default" w:ascii="Bodoni MT" w:hAnsi="Bodoni MT" w:eastAsia="等线" w:cs="Bodoni MT"/>
+          <w:sz w:val="22"/>
+          <w:szCs w:val="22"/>
+          <w:lang w:val="en-IN"/>
+        </w:rPr>
+        <w:t>At kernel level, both the containers (KinD container, container inside Pod) are same only (both are having an unique combination of namespace and cgroups).</w:t>
+      </w:r>
+      <w:r>
+        <w:rPr>
+          <w:rFonts w:hint="default" w:ascii="Bodoni MT" w:hAnsi="Bodoni MT" w:eastAsia="等线" w:cs="Bodoni MT"/>
+          <w:sz w:val="22"/>
+          <w:szCs w:val="22"/>
+          <w:lang w:val="en-IN"/>
+        </w:rPr>
+        <w:br w:type="textWrapping"/>
+      </w:r>
+      <w:r>
+        <w:rPr>
+          <w:rFonts w:hint="default" w:ascii="Bodoni MT" w:hAnsi="Bodoni MT" w:eastAsia="等线" w:cs="Bodoni MT"/>
+          <w:sz w:val="22"/>
+          <w:szCs w:val="22"/>
+          <w:lang w:val="en-IN"/>
+        </w:rPr>
+        <w:tab/>
+        <w:t>But from outside, it looks nested.</w:t>
+      </w:r>
+    </w:p>
+    <w:p>
+      <w:pPr>
+        <w:keepNext w:val="0"/>
+        <w:keepLines w:val="0"/>
+        <w:widowControl/>
+        <w:numPr>
+          <w:ilvl w:val="2"/>
+          <w:numId w:val="11"/>
+        </w:numPr>
+        <w:suppressLineNumbers w:val="0"/>
+        <w:spacing w:before="0" w:beforeAutospacing="0" w:after="0" w:afterAutospacing="0" w:line="360" w:lineRule="auto"/>
+        <w:ind w:left="1260" w:leftChars="0" w:right="0" w:hanging="420" w:firstLineChars="0"/>
+        <w:jc w:val="left"/>
+        <w:rPr>
+          <w:rFonts w:hint="default" w:ascii="Bodoni MT" w:hAnsi="Bodoni MT" w:eastAsia="等线" w:cs="Bodoni MT"/>
+          <w:sz w:val="22"/>
+          <w:szCs w:val="22"/>
+        </w:rPr>
+      </w:pPr>
     </w:p>
     <w:p>
       <w:pPr>
@@ -9106,13 +10964,73 @@
       <w:r>
         <w:rPr>
           <w:rFonts w:hint="default" w:ascii="Bodoni MT" w:hAnsi="Bodoni MT" w:eastAsia="等线" w:cs="Bodoni MT"/>
-          <w:color w:val="auto"/>
-          <w:kern w:val="0"/>
-          <w:sz w:val="22"/>
-          <w:szCs w:val="22"/>
-          <w:lang w:val="en-IN" w:eastAsia="zh-CN" w:bidi="ar"/>
-        </w:rPr>
-        <w:t>F</w:t>
+          <w:b/>
+          <w:bCs/>
+          <w:sz w:val="22"/>
+          <w:szCs w:val="22"/>
+          <w:lang w:val="en-IN"/>
+        </w:rPr>
+        <w:t>Civo</w:t>
+      </w:r>
+    </w:p>
+    <w:p>
+      <w:pPr>
+        <w:keepNext w:val="0"/>
+        <w:keepLines w:val="0"/>
+        <w:widowControl/>
+        <w:numPr>
+          <w:ilvl w:val="1"/>
+          <w:numId w:val="11"/>
+        </w:numPr>
+        <w:suppressLineNumbers w:val="0"/>
+        <w:spacing w:before="0" w:beforeAutospacing="0" w:after="0" w:afterAutospacing="0" w:line="360" w:lineRule="auto"/>
+        <w:ind w:left="840" w:leftChars="0" w:right="0" w:hanging="420" w:firstLineChars="0"/>
+        <w:jc w:val="left"/>
+        <w:rPr>
+          <w:rFonts w:hint="default" w:ascii="Bodoni MT" w:hAnsi="Bodoni MT" w:eastAsia="等线" w:cs="Bodoni MT"/>
+          <w:sz w:val="22"/>
+          <w:szCs w:val="22"/>
+        </w:rPr>
+      </w:pPr>
+      <w:r>
+        <w:rPr>
+          <w:rFonts w:hint="default" w:ascii="Bodoni MT" w:hAnsi="Bodoni MT" w:eastAsia="等线" w:cs="Bodoni MT"/>
+          <w:b w:val="0"/>
+          <w:bCs w:val="0"/>
+          <w:sz w:val="22"/>
+          <w:szCs w:val="22"/>
+          <w:lang w:val="en-IN"/>
+        </w:rPr>
+        <w:t>It is a cloud provide (like AWS, Azure, GCP) which provides managed Kubernetes (and cloud infrastructure).</w:t>
+      </w:r>
+    </w:p>
+    <w:p>
+      <w:pPr>
+        <w:keepNext w:val="0"/>
+        <w:keepLines w:val="0"/>
+        <w:widowControl/>
+        <w:numPr>
+          <w:ilvl w:val="1"/>
+          <w:numId w:val="11"/>
+        </w:numPr>
+        <w:suppressLineNumbers w:val="0"/>
+        <w:spacing w:before="0" w:beforeAutospacing="0" w:after="0" w:afterAutospacing="0" w:line="360" w:lineRule="auto"/>
+        <w:ind w:left="840" w:leftChars="0" w:right="0" w:hanging="420" w:firstLineChars="0"/>
+        <w:jc w:val="left"/>
+        <w:rPr>
+          <w:rFonts w:hint="default" w:ascii="Bodoni MT" w:hAnsi="Bodoni MT" w:eastAsia="等线" w:cs="Bodoni MT"/>
+          <w:sz w:val="22"/>
+          <w:szCs w:val="22"/>
+        </w:rPr>
+      </w:pPr>
+      <w:r>
+        <w:rPr>
+          <w:rFonts w:hint="default" w:ascii="Bodoni MT" w:hAnsi="Bodoni MT" w:eastAsia="等线" w:cs="Bodoni MT"/>
+          <w:sz w:val="22"/>
+          <w:szCs w:val="22"/>
+          <w:lang w:val="en-IN"/>
+        </w:rPr>
+        <w:t>It provides managed Kubernetes cluster, networking, virtual machines, storage.</w:t>
       </w:r>
     </w:p>
     <w:p>
@@ -9137,12 +11055,153 @@
       <w:r>
         <w:rPr>
           <w:rFonts w:hint="default" w:ascii="Bodoni MT" w:hAnsi="Bodoni MT" w:eastAsia="等线" w:cs="Bodoni MT"/>
-          <w:sz w:val="22"/>
-          <w:szCs w:val="22"/>
-          <w:lang w:val="en-IN"/>
-        </w:rPr>
-        <w:t>F</w:t>
-      </w:r>
+          <w:b/>
+          <w:bCs/>
+          <w:sz w:val="22"/>
+          <w:szCs w:val="22"/>
+          <w:lang w:val="en-IN"/>
+        </w:rPr>
+        <w:t>Nix</w:t>
+      </w:r>
+    </w:p>
+    <w:p>
+      <w:pPr>
+        <w:keepNext w:val="0"/>
+        <w:keepLines w:val="0"/>
+        <w:widowControl/>
+        <w:numPr>
+          <w:ilvl w:val="1"/>
+          <w:numId w:val="11"/>
+        </w:numPr>
+        <w:suppressLineNumbers w:val="0"/>
+        <w:spacing w:before="0" w:beforeAutospacing="0" w:after="0" w:afterAutospacing="0" w:line="360" w:lineRule="auto"/>
+        <w:ind w:left="840" w:leftChars="0" w:right="0" w:hanging="420" w:firstLineChars="0"/>
+        <w:jc w:val="left"/>
+        <w:rPr>
+          <w:rFonts w:hint="default" w:ascii="Bodoni MT" w:hAnsi="Bodoni MT" w:eastAsia="等线" w:cs="Bodoni MT"/>
+          <w:sz w:val="22"/>
+          <w:szCs w:val="22"/>
+        </w:rPr>
+      </w:pPr>
+      <w:r>
+        <w:rPr>
+          <w:rFonts w:hint="default" w:ascii="Bodoni MT" w:hAnsi="Bodoni MT" w:eastAsia="等线" w:cs="Bodoni MT"/>
+          <w:b w:val="0"/>
+          <w:bCs w:val="0"/>
+          <w:sz w:val="22"/>
+          <w:szCs w:val="22"/>
+          <w:lang w:val="en-IN"/>
+        </w:rPr>
+        <w:t>It is a package manager that just download the dependencies directly in your machine of any version you specifies but in a specific directory.</w:t>
+      </w:r>
+    </w:p>
+    <w:p>
+      <w:pPr>
+        <w:keepNext w:val="0"/>
+        <w:keepLines w:val="0"/>
+        <w:widowControl/>
+        <w:numPr>
+          <w:ilvl w:val="1"/>
+          <w:numId w:val="11"/>
+        </w:numPr>
+        <w:suppressLineNumbers w:val="0"/>
+        <w:spacing w:before="0" w:beforeAutospacing="0" w:after="0" w:afterAutospacing="0" w:line="360" w:lineRule="auto"/>
+        <w:ind w:left="840" w:leftChars="0" w:right="0" w:hanging="420" w:firstLineChars="0"/>
+        <w:jc w:val="left"/>
+        <w:rPr>
+          <w:rFonts w:hint="default" w:ascii="Bodoni MT" w:hAnsi="Bodoni MT" w:eastAsia="等线" w:cs="Bodoni MT"/>
+          <w:sz w:val="22"/>
+          <w:szCs w:val="22"/>
+        </w:rPr>
+      </w:pPr>
+      <w:r>
+        <w:rPr>
+          <w:rFonts w:hint="default" w:ascii="Bodoni MT" w:hAnsi="Bodoni MT" w:eastAsia="等线" w:cs="Bodoni MT"/>
+          <w:b w:val="0"/>
+          <w:bCs w:val="0"/>
+          <w:sz w:val="22"/>
+          <w:szCs w:val="22"/>
+          <w:lang w:val="en-IN"/>
+        </w:rPr>
+        <w:t>Its similar to docker in context of keeping dependencies at some directory but it doesn’t have any containers.</w:t>
+      </w:r>
+    </w:p>
+    <w:p>
+      <w:pPr>
+        <w:keepNext w:val="0"/>
+        <w:keepLines w:val="0"/>
+        <w:widowControl/>
+        <w:numPr>
+          <w:ilvl w:val="1"/>
+          <w:numId w:val="11"/>
+        </w:numPr>
+        <w:suppressLineNumbers w:val="0"/>
+        <w:spacing w:before="0" w:beforeAutospacing="0" w:after="0" w:afterAutospacing="0" w:line="360" w:lineRule="auto"/>
+        <w:ind w:left="840" w:leftChars="0" w:right="0" w:hanging="420" w:firstLineChars="0"/>
+        <w:jc w:val="left"/>
+        <w:rPr>
+          <w:rFonts w:hint="default" w:ascii="Bodoni MT" w:hAnsi="Bodoni MT" w:eastAsia="等线" w:cs="Bodoni MT"/>
+          <w:sz w:val="22"/>
+          <w:szCs w:val="22"/>
+        </w:rPr>
+      </w:pPr>
+      <w:bookmarkStart w:id="0" w:name="_GoBack"/>
+      <w:r>
+        <w:rPr>
+          <w:rFonts w:hint="default" w:ascii="Bodoni MT" w:hAnsi="Bodoni MT" w:eastAsia="等线" w:cs="Bodoni MT"/>
+          <w:b/>
+          <w:bCs/>
+          <w:color w:val="C00000"/>
+          <w:sz w:val="22"/>
+          <w:szCs w:val="22"/>
+          <w:lang w:val="en-IN"/>
+        </w:rPr>
+        <w:t>DevBox</w:t>
+      </w:r>
+      <w:r>
+        <w:rPr>
+          <w:rFonts w:hint="default" w:ascii="Bodoni MT" w:hAnsi="Bodoni MT" w:eastAsia="等线" w:cs="Bodoni MT"/>
+          <w:b w:val="0"/>
+          <w:bCs w:val="0"/>
+          <w:color w:val="C00000"/>
+          <w:sz w:val="22"/>
+          <w:szCs w:val="22"/>
+          <w:lang w:val="en-IN"/>
+        </w:rPr>
+        <w:t xml:space="preserve"> </w:t>
+      </w:r>
+      <w:bookmarkEnd w:id="0"/>
+      <w:r>
+        <w:rPr>
+          <w:rFonts w:hint="default" w:ascii="Bodoni MT" w:hAnsi="Bodoni MT" w:eastAsia="等线" w:cs="Bodoni MT"/>
+          <w:b w:val="0"/>
+          <w:bCs w:val="0"/>
+          <w:sz w:val="22"/>
+          <w:szCs w:val="22"/>
+          <w:lang w:val="en-IN"/>
+        </w:rPr>
+        <w:t>is a wrapper written on the top of Nix to make it simpler.</w:t>
+      </w:r>
+    </w:p>
+    <w:p>
+      <w:pPr>
+        <w:keepNext w:val="0"/>
+        <w:keepLines w:val="0"/>
+        <w:widowControl/>
+        <w:numPr>
+          <w:ilvl w:val="1"/>
+          <w:numId w:val="11"/>
+        </w:numPr>
+        <w:suppressLineNumbers w:val="0"/>
+        <w:spacing w:before="0" w:beforeAutospacing="0" w:after="0" w:afterAutospacing="0" w:line="360" w:lineRule="auto"/>
+        <w:ind w:left="840" w:leftChars="0" w:right="0" w:hanging="420" w:firstLineChars="0"/>
+        <w:jc w:val="left"/>
+        <w:rPr>
+          <w:rFonts w:hint="default" w:ascii="Bodoni MT" w:hAnsi="Bodoni MT" w:eastAsia="等线" w:cs="Bodoni MT"/>
+          <w:sz w:val="22"/>
+          <w:szCs w:val="22"/>
+        </w:rPr>
+      </w:pPr>
     </w:p>
     <w:p>
       <w:pPr>
@@ -9801,66 +11860,14 @@
           <w:szCs w:val="22"/>
         </w:rPr>
       </w:pPr>
-      <w:r>
-        <w:rPr>
-          <w:rFonts w:hint="default" w:ascii="Bodoni MT" w:hAnsi="Bodoni MT" w:eastAsia="等线" w:cs="Bodoni MT"/>
-          <w:sz w:val="22"/>
-          <w:szCs w:val="22"/>
-          <w:lang w:val="en-IN"/>
-        </w:rPr>
-        <w:t>F</w:t>
-      </w:r>
     </w:p>
     <w:p>
       <w:pPr>
-        <w:keepNext w:val="0"/>
-        <w:keepLines w:val="0"/>
-        <w:widowControl/>
-        <w:numPr>
-          <w:ilvl w:val="0"/>
-          <w:numId w:val="11"/>
-        </w:numPr>
-        <w:suppressLineNumbers w:val="0"/>
-        <w:spacing w:before="0" w:beforeAutospacing="0" w:after="0" w:afterAutospacing="0" w:line="360" w:lineRule="auto"/>
-        <w:ind w:left="420" w:leftChars="0" w:right="0" w:hanging="420" w:firstLineChars="0"/>
-        <w:jc w:val="left"/>
-        <w:rPr>
-          <w:rFonts w:hint="default" w:ascii="Bodoni MT" w:hAnsi="Bodoni MT" w:eastAsia="等线" w:cs="Bodoni MT"/>
-          <w:sz w:val="22"/>
-          <w:szCs w:val="22"/>
-        </w:rPr>
-      </w:pPr>
-      <w:r>
-        <w:rPr>
-          <w:rFonts w:hint="default" w:ascii="Bodoni MT" w:hAnsi="Bodoni MT" w:eastAsia="等线" w:cs="Bodoni MT"/>
-          <w:sz w:val="22"/>
-          <w:szCs w:val="22"/>
-          <w:lang w:val="en-IN"/>
-        </w:rPr>
-        <w:t>F</w:t>
-      </w:r>
+        <w:rPr>
+          <w:rFonts w:hint="default" w:ascii="Bodoni MT" w:hAnsi="Bodoni MT" w:cs="Bodoni MT"/>
+        </w:rPr>
+      </w:pPr>
     </w:p>
-    <w:p>
-      <w:pPr>
-        <w:keepNext w:val="0"/>
-        <w:keepLines w:val="0"/>
-        <w:widowControl/>
-        <w:numPr>
-          <w:ilvl w:val="0"/>
-          <w:numId w:val="11"/>
-        </w:numPr>
-        <w:suppressLineNumbers w:val="0"/>
-        <w:spacing w:before="0" w:beforeAutospacing="0" w:after="0" w:afterAutospacing="0" w:line="360" w:lineRule="auto"/>
-        <w:ind w:left="420" w:leftChars="0" w:right="0" w:hanging="420" w:firstLineChars="0"/>
-        <w:jc w:val="left"/>
-        <w:rPr>
-          <w:rFonts w:hint="default" w:ascii="Bodoni MT" w:hAnsi="Bodoni MT" w:eastAsia="等线" w:cs="Bodoni MT"/>
-          <w:sz w:val="22"/>
-          <w:szCs w:val="22"/>
-        </w:rPr>
-      </w:pPr>
-    </w:p>
-    <w:p/>
     <w:sectPr>
       <w:pgSz w:w="11906" w:h="16838"/>
       <w:pgMar w:top="1440" w:right="1800" w:bottom="1440" w:left="1800" w:header="720" w:footer="720" w:gutter="0"/>
@@ -10446,7 +12453,7 @@
     <w:lsdException w:qFormat="1" w:unhideWhenUsed="0" w:uiPriority="0" w:semiHidden="0" w:name="macro"/>
     <w:lsdException w:unhideWhenUsed="0" w:uiPriority="0" w:semiHidden="0" w:name="toa heading"/>
     <w:lsdException w:qFormat="1" w:unhideWhenUsed="0" w:uiPriority="0" w:semiHidden="0" w:name="List"/>
-    <w:lsdException w:unhideWhenUsed="0" w:uiPriority="0" w:semiHidden="0" w:name="List Bullet"/>
+    <w:lsdException w:qFormat="1" w:unhideWhenUsed="0" w:uiPriority="0" w:semiHidden="0" w:name="List Bullet"/>
     <w:lsdException w:qFormat="1" w:unhideWhenUsed="0" w:uiPriority="0" w:semiHidden="0" w:name="List Number"/>
     <w:lsdException w:qFormat="1" w:unhideWhenUsed="0" w:uiPriority="0" w:semiHidden="0" w:name="List 2"/>
     <w:lsdException w:qFormat="1" w:unhideWhenUsed="0" w:uiPriority="0" w:semiHidden="0" w:name="List 3"/>
@@ -10467,7 +12474,7 @@
     <w:lsdException w:qFormat="1" w:unhideWhenUsed="0" w:uiPriority="0" w:semiHidden="0" w:name="Body Text"/>
     <w:lsdException w:qFormat="1" w:unhideWhenUsed="0" w:uiPriority="0" w:semiHidden="0" w:name="Body Text Indent"/>
     <w:lsdException w:qFormat="1" w:unhideWhenUsed="0" w:uiPriority="0" w:semiHidden="0" w:name="List Continue"/>
-    <w:lsdException w:unhideWhenUsed="0" w:uiPriority="0" w:semiHidden="0" w:name="List Continue 2"/>
+    <w:lsdException w:qFormat="1" w:unhideWhenUsed="0" w:uiPriority="0" w:semiHidden="0" w:name="List Continue 2"/>
     <w:lsdException w:qFormat="1" w:unhideWhenUsed="0" w:uiPriority="0" w:semiHidden="0" w:name="List Continue 3"/>
     <w:lsdException w:qFormat="1" w:unhideWhenUsed="0" w:uiPriority="0" w:semiHidden="0" w:name="List Continue 4"/>
     <w:lsdException w:qFormat="1" w:unhideWhenUsed="0" w:uiPriority="0" w:semiHidden="0" w:name="List Continue 5"/>
@@ -10483,7 +12490,7 @@
     <w:lsdException w:qFormat="1" w:unhideWhenUsed="0" w:uiPriority="0" w:semiHidden="0" w:name="Body Text Indent 2"/>
     <w:lsdException w:qFormat="1" w:unhideWhenUsed="0" w:uiPriority="0" w:semiHidden="0" w:name="Body Text Indent 3"/>
     <w:lsdException w:qFormat="1" w:unhideWhenUsed="0" w:uiPriority="0" w:semiHidden="0" w:name="Block Text"/>
-    <w:lsdException w:unhideWhenUsed="0" w:uiPriority="0" w:semiHidden="0" w:name="Hyperlink"/>
+    <w:lsdException w:qFormat="1" w:unhideWhenUsed="0" w:uiPriority="0" w:semiHidden="0" w:name="Hyperlink"/>
     <w:lsdException w:qFormat="1" w:unhideWhenUsed="0" w:uiPriority="0" w:semiHidden="0" w:name="FollowedHyperlink"/>
     <w:lsdException w:qFormat="1" w:unhideWhenUsed="0" w:uiPriority="0" w:semiHidden="0" w:name="Strong"/>
     <w:lsdException w:qFormat="1" w:unhideWhenUsed="0" w:uiPriority="0" w:semiHidden="0" w:name="Emphasis"/>
@@ -10497,10 +12504,10 @@
     <w:lsdException w:qFormat="1" w:unhideWhenUsed="0" w:uiPriority="0" w:semiHidden="0" w:name="HTML Code"/>
     <w:lsdException w:qFormat="1" w:unhideWhenUsed="0" w:uiPriority="0" w:semiHidden="0" w:name="HTML Definition"/>
     <w:lsdException w:qFormat="1" w:unhideWhenUsed="0" w:uiPriority="0" w:semiHidden="0" w:name="HTML Keyboard"/>
-    <w:lsdException w:unhideWhenUsed="0" w:uiPriority="0" w:semiHidden="0" w:name="HTML Preformatted"/>
+    <w:lsdException w:qFormat="1" w:unhideWhenUsed="0" w:uiPriority="0" w:semiHidden="0" w:name="HTML Preformatted"/>
     <w:lsdException w:qFormat="1" w:unhideWhenUsed="0" w:uiPriority="0" w:semiHidden="0" w:name="HTML Sample"/>
     <w:lsdException w:qFormat="1" w:unhideWhenUsed="0" w:uiPriority="0" w:semiHidden="0" w:name="HTML Typewriter"/>
-    <w:lsdException w:unhideWhenUsed="0" w:uiPriority="0" w:semiHidden="0" w:name="HTML Variable"/>
+    <w:lsdException w:qFormat="1" w:unhideWhenUsed="0" w:uiPriority="0" w:semiHidden="0" w:name="HTML Variable"/>
     <w:lsdException w:qFormat="1" w:unhideWhenUsed="0" w:uiPriority="0" w:name="Normal Table"/>
     <w:lsdException w:qFormat="1" w:unhideWhenUsed="0" w:uiPriority="0" w:semiHidden="0" w:name="annotation subject"/>
     <w:lsdException w:unhideWhenUsed="0" w:uiPriority="0" w:semiHidden="0" w:name="Table Simple 1"/>
@@ -10508,13 +12515,13 @@
     <w:lsdException w:unhideWhenUsed="0" w:uiPriority="0" w:semiHidden="0" w:name="Table Simple 3"/>
     <w:lsdException w:qFormat="1" w:unhideWhenUsed="0" w:uiPriority="0" w:semiHidden="0" w:name="Table Classic 1"/>
     <w:lsdException w:qFormat="1" w:unhideWhenUsed="0" w:uiPriority="0" w:semiHidden="0" w:name="Table Classic 2"/>
-    <w:lsdException w:unhideWhenUsed="0" w:uiPriority="0" w:semiHidden="0" w:name="Table Classic 3"/>
-    <w:lsdException w:unhideWhenUsed="0" w:uiPriority="0" w:semiHidden="0" w:name="Table Classic 4"/>
-    <w:lsdException w:unhideWhenUsed="0" w:uiPriority="0" w:semiHidden="0" w:name="Table Colorful 1"/>
-    <w:lsdException w:unhideWhenUsed="0" w:uiPriority="0" w:semiHidden="0" w:name="Table Colorful 2"/>
-    <w:lsdException w:unhideWhenUsed="0" w:uiPriority="0" w:semiHidden="0" w:name="Table Colorful 3"/>
-    <w:lsdException w:unhideWhenUsed="0" w:uiPriority="0" w:semiHidden="0" w:name="Table Columns 1"/>
-    <w:lsdException w:unhideWhenUsed="0" w:uiPriority="0" w:semiHidden="0" w:name="Table Columns 2"/>
+    <w:lsdException w:qFormat="1" w:unhideWhenUsed="0" w:uiPriority="0" w:semiHidden="0" w:name="Table Classic 3"/>
+    <w:lsdException w:qFormat="1" w:unhideWhenUsed="0" w:uiPriority="0" w:semiHidden="0" w:name="Table Classic 4"/>
+    <w:lsdException w:qFormat="1" w:unhideWhenUsed="0" w:uiPriority="0" w:semiHidden="0" w:name="Table Colorful 1"/>
+    <w:lsdException w:qFormat="1" w:unhideWhenUsed="0" w:uiPriority="0" w:semiHidden="0" w:name="Table Colorful 2"/>
+    <w:lsdException w:qFormat="1" w:unhideWhenUsed="0" w:uiPriority="0" w:semiHidden="0" w:name="Table Colorful 3"/>
+    <w:lsdException w:qFormat="1" w:unhideWhenUsed="0" w:uiPriority="0" w:semiHidden="0" w:name="Table Columns 1"/>
+    <w:lsdException w:qFormat="1" w:unhideWhenUsed="0" w:uiPriority="0" w:semiHidden="0" w:name="Table Columns 2"/>
     <w:lsdException w:unhideWhenUsed="0" w:uiPriority="0" w:semiHidden="0" w:name="Table Columns 3"/>
     <w:lsdException w:unhideWhenUsed="0" w:uiPriority="0" w:semiHidden="0" w:name="Table Columns 4"/>
     <w:lsdException w:unhideWhenUsed="0" w:uiPriority="0" w:semiHidden="0" w:name="Table Columns 5"/>
@@ -11228,6 +13235,7 @@
   <w:style w:type="paragraph" w:styleId="47">
     <w:name w:val="HTML Preformatted"/>
     <w:basedOn w:val="1"/>
+    <w:qFormat/>
     <w:uiPriority w:val="0"/>
     <w:rPr>
       <w:rFonts w:ascii="Courier New" w:hAnsi="Courier New" w:cs="Courier New"/>
@@ -11257,6 +13265,7 @@
   <w:style w:type="character" w:styleId="50">
     <w:name w:val="HTML Variable"/>
     <w:basedOn w:val="11"/>
+    <w:qFormat/>
     <w:uiPriority w:val="0"/>
     <w:rPr>
       <w:i/>
@@ -11266,6 +13275,7 @@
   <w:style w:type="character" w:styleId="51">
     <w:name w:val="Hyperlink"/>
     <w:basedOn w:val="11"/>
+    <w:qFormat/>
     <w:uiPriority w:val="0"/>
     <w:rPr>
       <w:color w:val="0000FF"/>
@@ -11425,6 +13435,7 @@
   <w:style w:type="paragraph" w:styleId="68">
     <w:name w:val="List Bullet"/>
     <w:basedOn w:val="1"/>
+    <w:qFormat/>
     <w:uiPriority w:val="0"/>
     <w:pPr>
       <w:numPr>
@@ -11494,6 +13505,7 @@
   <w:style w:type="paragraph" w:styleId="74">
     <w:name w:val="List Continue 2"/>
     <w:basedOn w:val="1"/>
+    <w:qFormat/>
     <w:uiPriority w:val="0"/>
     <w:pPr>
       <w:spacing w:after="120"/>
@@ -12187,6 +14199,7 @@
   <w:style w:type="table" w:styleId="99">
     <w:name w:val="Table Classic 3"/>
     <w:basedOn w:val="12"/>
+    <w:qFormat/>
     <w:uiPriority w:val="0"/>
     <w:pPr>
       <w:widowControl w:val="0"/>
@@ -12256,6 +14269,7 @@
   <w:style w:type="table" w:styleId="100">
     <w:name w:val="Table Classic 4"/>
     <w:basedOn w:val="12"/>
+    <w:qFormat/>
     <w:uiPriority w:val="0"/>
     <w:pPr>
       <w:widowControl w:val="0"/>
@@ -12346,6 +14360,7 @@
   <w:style w:type="table" w:styleId="101">
     <w:name w:val="Table Colorful 1"/>
     <w:basedOn w:val="12"/>
+    <w:qFormat/>
     <w:uiPriority w:val="0"/>
     <w:pPr>
       <w:widowControl w:val="0"/>
@@ -12427,6 +14442,7 @@
   <w:style w:type="table" w:styleId="102">
     <w:name w:val="Table Colorful 2"/>
     <w:basedOn w:val="12"/>
+    <w:qFormat/>
     <w:uiPriority w:val="0"/>
     <w:pPr>
       <w:widowControl w:val="0"/>
@@ -12502,6 +14518,7 @@
   <w:style w:type="table" w:styleId="103">
     <w:name w:val="Table Colorful 3"/>
     <w:basedOn w:val="12"/>
+    <w:qFormat/>
     <w:uiPriority w:val="0"/>
     <w:pPr>
       <w:widowControl w:val="0"/>
@@ -12561,6 +14578,7 @@
   <w:style w:type="table" w:styleId="104">
     <w:name w:val="Table Columns 1"/>
     <w:basedOn w:val="12"/>
+    <w:qFormat/>
     <w:uiPriority w:val="0"/>
     <w:pPr>
       <w:widowControl w:val="0"/>
@@ -12679,6 +14697,7 @@
   <w:style w:type="table" w:styleId="105">
     <w:name w:val="Table Columns 2"/>
     <w:basedOn w:val="12"/>
+    <w:qFormat/>
     <w:uiPriority w:val="0"/>
     <w:pPr>
       <w:widowControl w:val="0"/>

</xml_diff>